<commit_message>
Doc(SRS): Actualizacao do SRS. Topicos actualizados: - Necessidades Identificadas; - Requisitos Identificados (Brutos); - Descrição Geral do Sistema: Perspectiva do Produto, Funções do Produto; - Relactorio de Viabilidade: Resumo Executivo
</commit_message>
<xml_diff>
--- a/Projeto modelo dezembro de 2025 - Copy.docx
+++ b/Projeto modelo dezembro de 2025 - Copy.docx
@@ -64,16 +64,7 @@
           <w:sz w:val="24"/>
           <w:szCs w:val="24"/>
         </w:rPr>
-        <w:t>O mercado moçambicano apresenta um crescimento constante no setor empresarial, com um número crescente de pequenas e médias empresas (</w:t>
-      </w:r>
-      <w:proofErr w:type="spellStart"/>
-      <w:r>
-        <w:rPr>
-          <w:rFonts w:ascii="Times New Roman" w:hAnsi="Times New Roman" w:cs="Times New Roman"/>
-          <w:sz w:val="24"/>
-          <w:szCs w:val="24"/>
-        </w:rPr>
-        <w:t>PME</w:t>
+        <w:t>O mercado moçambicano apresenta um crescimento constante no setor empresarial, com um número crescente de pequenas e médias empresas (PME</w:t>
       </w:r>
       <w:r>
         <w:rPr>
@@ -89,16 +80,7 @@
           <w:sz w:val="24"/>
           <w:szCs w:val="24"/>
         </w:rPr>
-        <w:t>s</w:t>
-      </w:r>
-      <w:proofErr w:type="spellEnd"/>
-      <w:r>
-        <w:rPr>
-          <w:rFonts w:ascii="Times New Roman" w:hAnsi="Times New Roman" w:cs="Times New Roman"/>
-          <w:sz w:val="24"/>
-          <w:szCs w:val="24"/>
-        </w:rPr>
-        <w:t>) a expandirem operações de comércio, retalho e distribuição. A digitalização de processos financeiros e de gestão de stock ainda é parcial, com muitas empresas a depender de soluções manuais, planilhas ou sistemas desatualizados.</w:t>
+        <w:t>s) a expandirem operações de comércio, retalho e distribuição. A digitalização de processos financeiros e de gestão de stock ainda é parcial, com muitas empresas a depender de soluções manuais, planilhas ou sistemas desatualizados.</w:t>
       </w:r>
     </w:p>
     <w:p>
@@ -124,9 +106,10 @@
     </w:p>
     <w:p>
       <w:pPr>
+        <w:pStyle w:val="ListParagraph"/>
         <w:numPr>
           <w:ilvl w:val="0"/>
-          <w:numId w:val="24"/>
+          <w:numId w:val="34"/>
         </w:numPr>
         <w:spacing w:line="360" w:lineRule="auto"/>
         <w:jc w:val="both"/>
@@ -147,9 +130,10 @@
     </w:p>
     <w:p>
       <w:pPr>
+        <w:pStyle w:val="ListParagraph"/>
         <w:numPr>
           <w:ilvl w:val="0"/>
-          <w:numId w:val="24"/>
+          <w:numId w:val="34"/>
         </w:numPr>
         <w:spacing w:line="360" w:lineRule="auto"/>
         <w:jc w:val="both"/>
@@ -170,9 +154,10 @@
     </w:p>
     <w:p>
       <w:pPr>
+        <w:pStyle w:val="ListParagraph"/>
         <w:numPr>
           <w:ilvl w:val="0"/>
-          <w:numId w:val="24"/>
+          <w:numId w:val="34"/>
         </w:numPr>
         <w:spacing w:line="360" w:lineRule="auto"/>
         <w:jc w:val="both"/>
@@ -193,9 +178,10 @@
     </w:p>
     <w:p>
       <w:pPr>
+        <w:pStyle w:val="ListParagraph"/>
         <w:numPr>
           <w:ilvl w:val="0"/>
-          <w:numId w:val="24"/>
+          <w:numId w:val="34"/>
         </w:numPr>
         <w:spacing w:line="360" w:lineRule="auto"/>
         <w:jc w:val="both"/>
@@ -216,9 +202,10 @@
     </w:p>
     <w:p>
       <w:pPr>
+        <w:pStyle w:val="ListParagraph"/>
         <w:numPr>
           <w:ilvl w:val="0"/>
-          <w:numId w:val="24"/>
+          <w:numId w:val="34"/>
         </w:numPr>
         <w:spacing w:line="360" w:lineRule="auto"/>
         <w:jc w:val="both"/>
@@ -239,9 +226,10 @@
     </w:p>
     <w:p>
       <w:pPr>
+        <w:pStyle w:val="ListParagraph"/>
         <w:numPr>
           <w:ilvl w:val="0"/>
-          <w:numId w:val="24"/>
+          <w:numId w:val="34"/>
         </w:numPr>
         <w:spacing w:line="360" w:lineRule="auto"/>
         <w:jc w:val="both"/>
@@ -262,9 +250,10 @@
     </w:p>
     <w:p>
       <w:pPr>
+        <w:pStyle w:val="ListParagraph"/>
         <w:numPr>
           <w:ilvl w:val="0"/>
-          <w:numId w:val="24"/>
+          <w:numId w:val="34"/>
         </w:numPr>
         <w:spacing w:line="360" w:lineRule="auto"/>
         <w:jc w:val="both"/>
@@ -282,6 +271,19 @@
         </w:rPr>
         <w:t>Segurança da informação e controlo de acessos.</w:t>
       </w:r>
+    </w:p>
+    <w:p>
+      <w:pPr>
+        <w:spacing w:line="360" w:lineRule="auto"/>
+        <w:jc w:val="both"/>
+        <w:rPr>
+          <w:rFonts w:ascii="Times New Roman" w:hAnsi="Times New Roman" w:cs="Times New Roman"/>
+          <w:b/>
+          <w:bCs/>
+          <w:sz w:val="24"/>
+          <w:szCs w:val="24"/>
+        </w:rPr>
+      </w:pPr>
     </w:p>
     <w:p>
       <w:pPr>
@@ -311,15 +313,15 @@
         <w:tblLook w:val="04A0" w:firstRow="1" w:lastRow="0" w:firstColumn="1" w:lastColumn="0" w:noHBand="0" w:noVBand="1"/>
       </w:tblPr>
       <w:tblGrid>
-        <w:gridCol w:w="1690"/>
-        <w:gridCol w:w="2189"/>
+        <w:gridCol w:w="1885"/>
+        <w:gridCol w:w="1994"/>
         <w:gridCol w:w="1982"/>
         <w:gridCol w:w="2483"/>
       </w:tblGrid>
       <w:tr>
         <w:tc>
           <w:tcPr>
-            <w:tcW w:w="1690" w:type="dxa"/>
+            <w:tcW w:w="1885" w:type="dxa"/>
             <w:hideMark/>
           </w:tcPr>
           <w:p>
@@ -348,7 +350,7 @@
         </w:tc>
         <w:tc>
           <w:tcPr>
-            <w:tcW w:w="2189" w:type="dxa"/>
+            <w:tcW w:w="1994" w:type="dxa"/>
             <w:hideMark/>
           </w:tcPr>
           <w:p>
@@ -437,13 +439,13 @@
       <w:tr>
         <w:tc>
           <w:tcPr>
-            <w:tcW w:w="1690" w:type="dxa"/>
+            <w:tcW w:w="1885" w:type="dxa"/>
+            <w:vAlign w:val="center"/>
             <w:hideMark/>
           </w:tcPr>
           <w:p>
             <w:pPr>
               <w:spacing w:line="360" w:lineRule="auto"/>
-              <w:jc w:val="both"/>
               <w:rPr>
                 <w:rFonts w:ascii="Times New Roman" w:hAnsi="Times New Roman" w:cs="Times New Roman"/>
                 <w:sz w:val="24"/>
@@ -462,13 +464,13 @@
         </w:tc>
         <w:tc>
           <w:tcPr>
-            <w:tcW w:w="2189" w:type="dxa"/>
+            <w:tcW w:w="1994" w:type="dxa"/>
+            <w:vAlign w:val="center"/>
             <w:hideMark/>
           </w:tcPr>
           <w:p>
             <w:pPr>
               <w:spacing w:line="360" w:lineRule="auto"/>
-              <w:jc w:val="both"/>
               <w:rPr>
                 <w:rFonts w:ascii="Times New Roman" w:hAnsi="Times New Roman" w:cs="Times New Roman"/>
                 <w:sz w:val="24"/>
@@ -488,12 +490,12 @@
         <w:tc>
           <w:tcPr>
             <w:tcW w:w="1982" w:type="dxa"/>
+            <w:vAlign w:val="center"/>
             <w:hideMark/>
           </w:tcPr>
           <w:p>
             <w:pPr>
               <w:spacing w:line="360" w:lineRule="auto"/>
-              <w:jc w:val="both"/>
               <w:rPr>
                 <w:rFonts w:ascii="Times New Roman" w:hAnsi="Times New Roman" w:cs="Times New Roman"/>
                 <w:sz w:val="24"/>
@@ -513,12 +515,12 @@
         <w:tc>
           <w:tcPr>
             <w:tcW w:w="2483" w:type="dxa"/>
+            <w:vAlign w:val="center"/>
             <w:hideMark/>
           </w:tcPr>
           <w:p>
             <w:pPr>
               <w:spacing w:line="360" w:lineRule="auto"/>
-              <w:jc w:val="both"/>
               <w:rPr>
                 <w:rFonts w:ascii="Times New Roman" w:hAnsi="Times New Roman" w:cs="Times New Roman"/>
                 <w:sz w:val="24"/>
@@ -539,13 +541,13 @@
       <w:tr>
         <w:tc>
           <w:tcPr>
-            <w:tcW w:w="1690" w:type="dxa"/>
+            <w:tcW w:w="1885" w:type="dxa"/>
+            <w:vAlign w:val="center"/>
             <w:hideMark/>
           </w:tcPr>
           <w:p>
             <w:pPr>
               <w:spacing w:line="360" w:lineRule="auto"/>
-              <w:jc w:val="both"/>
               <w:rPr>
                 <w:rFonts w:ascii="Times New Roman" w:hAnsi="Times New Roman" w:cs="Times New Roman"/>
                 <w:sz w:val="24"/>
@@ -564,13 +566,13 @@
         </w:tc>
         <w:tc>
           <w:tcPr>
-            <w:tcW w:w="2189" w:type="dxa"/>
+            <w:tcW w:w="1994" w:type="dxa"/>
+            <w:vAlign w:val="center"/>
             <w:hideMark/>
           </w:tcPr>
           <w:p>
             <w:pPr>
               <w:spacing w:line="360" w:lineRule="auto"/>
-              <w:jc w:val="both"/>
               <w:rPr>
                 <w:rFonts w:ascii="Times New Roman" w:hAnsi="Times New Roman" w:cs="Times New Roman"/>
                 <w:sz w:val="24"/>
@@ -590,12 +592,12 @@
         <w:tc>
           <w:tcPr>
             <w:tcW w:w="1982" w:type="dxa"/>
+            <w:vAlign w:val="center"/>
             <w:hideMark/>
           </w:tcPr>
           <w:p>
             <w:pPr>
               <w:spacing w:line="360" w:lineRule="auto"/>
-              <w:jc w:val="both"/>
               <w:rPr>
                 <w:rFonts w:ascii="Times New Roman" w:hAnsi="Times New Roman" w:cs="Times New Roman"/>
                 <w:sz w:val="24"/>
@@ -615,12 +617,12 @@
         <w:tc>
           <w:tcPr>
             <w:tcW w:w="2483" w:type="dxa"/>
+            <w:vAlign w:val="center"/>
             <w:hideMark/>
           </w:tcPr>
           <w:p>
             <w:pPr>
               <w:spacing w:line="360" w:lineRule="auto"/>
-              <w:jc w:val="both"/>
               <w:rPr>
                 <w:rFonts w:ascii="Times New Roman" w:hAnsi="Times New Roman" w:cs="Times New Roman"/>
                 <w:sz w:val="24"/>
@@ -633,16 +635,7 @@
                 <w:sz w:val="24"/>
                 <w:szCs w:val="24"/>
               </w:rPr>
-              <w:t xml:space="preserve">Alto custo, pouco flexível para </w:t>
-            </w:r>
-            <w:proofErr w:type="spellStart"/>
-            <w:r>
-              <w:rPr>
-                <w:rFonts w:ascii="Times New Roman" w:hAnsi="Times New Roman" w:cs="Times New Roman"/>
-                <w:sz w:val="24"/>
-                <w:szCs w:val="24"/>
-              </w:rPr>
-              <w:t>PME</w:t>
+              <w:t>Alto custo, pouco flexível para PME</w:t>
             </w:r>
             <w:r>
               <w:rPr>
@@ -660,20 +653,19 @@
               </w:rPr>
               <w:t>s</w:t>
             </w:r>
-            <w:proofErr w:type="spellEnd"/>
           </w:p>
         </w:tc>
       </w:tr>
       <w:tr>
         <w:tc>
           <w:tcPr>
-            <w:tcW w:w="1690" w:type="dxa"/>
+            <w:tcW w:w="1885" w:type="dxa"/>
+            <w:vAlign w:val="center"/>
             <w:hideMark/>
           </w:tcPr>
           <w:p>
             <w:pPr>
               <w:spacing w:line="360" w:lineRule="auto"/>
-              <w:jc w:val="both"/>
               <w:rPr>
                 <w:rFonts w:ascii="Times New Roman" w:hAnsi="Times New Roman" w:cs="Times New Roman"/>
                 <w:sz w:val="24"/>
@@ -686,37 +678,19 @@
                 <w:sz w:val="24"/>
                 <w:szCs w:val="24"/>
               </w:rPr>
-              <w:t xml:space="preserve">Sage </w:t>
-            </w:r>
-            <w:proofErr w:type="spellStart"/>
-            <w:r>
-              <w:rPr>
-                <w:rFonts w:ascii="Times New Roman" w:hAnsi="Times New Roman" w:cs="Times New Roman"/>
-                <w:sz w:val="24"/>
-                <w:szCs w:val="24"/>
-              </w:rPr>
-              <w:t>One</w:t>
-            </w:r>
-            <w:proofErr w:type="spellEnd"/>
-            <w:r>
-              <w:rPr>
-                <w:rFonts w:ascii="Times New Roman" w:hAnsi="Times New Roman" w:cs="Times New Roman"/>
-                <w:sz w:val="24"/>
-                <w:szCs w:val="24"/>
-              </w:rPr>
-              <w:t xml:space="preserve"> /Sage 50</w:t>
+              <w:t>Sage One /Sage 50</w:t>
             </w:r>
           </w:p>
         </w:tc>
         <w:tc>
           <w:tcPr>
-            <w:tcW w:w="2189" w:type="dxa"/>
+            <w:tcW w:w="1994" w:type="dxa"/>
+            <w:vAlign w:val="center"/>
             <w:hideMark/>
           </w:tcPr>
           <w:p>
             <w:pPr>
               <w:spacing w:line="360" w:lineRule="auto"/>
-              <w:jc w:val="both"/>
               <w:rPr>
                 <w:rFonts w:ascii="Times New Roman" w:hAnsi="Times New Roman" w:cs="Times New Roman"/>
                 <w:sz w:val="24"/>
@@ -736,12 +710,12 @@
         <w:tc>
           <w:tcPr>
             <w:tcW w:w="1982" w:type="dxa"/>
+            <w:vAlign w:val="center"/>
             <w:hideMark/>
           </w:tcPr>
           <w:p>
             <w:pPr>
               <w:spacing w:line="360" w:lineRule="auto"/>
-              <w:jc w:val="both"/>
               <w:rPr>
                 <w:rFonts w:ascii="Times New Roman" w:hAnsi="Times New Roman" w:cs="Times New Roman"/>
                 <w:sz w:val="24"/>
@@ -761,12 +735,12 @@
         <w:tc>
           <w:tcPr>
             <w:tcW w:w="2483" w:type="dxa"/>
+            <w:vAlign w:val="center"/>
             <w:hideMark/>
           </w:tcPr>
           <w:p>
             <w:pPr>
               <w:spacing w:line="360" w:lineRule="auto"/>
-              <w:jc w:val="both"/>
               <w:rPr>
                 <w:rFonts w:ascii="Times New Roman" w:hAnsi="Times New Roman" w:cs="Times New Roman"/>
                 <w:sz w:val="24"/>
@@ -837,9 +811,10 @@
     </w:p>
     <w:p>
       <w:pPr>
+        <w:pStyle w:val="ListParagraph"/>
         <w:numPr>
           <w:ilvl w:val="0"/>
-          <w:numId w:val="25"/>
+          <w:numId w:val="35"/>
         </w:numPr>
         <w:spacing w:line="360" w:lineRule="auto"/>
         <w:jc w:val="both"/>
@@ -876,9 +851,10 @@
     </w:p>
     <w:p>
       <w:pPr>
+        <w:pStyle w:val="ListParagraph"/>
         <w:numPr>
           <w:ilvl w:val="0"/>
-          <w:numId w:val="25"/>
+          <w:numId w:val="35"/>
         </w:numPr>
         <w:spacing w:line="360" w:lineRule="auto"/>
         <w:jc w:val="both"/>
@@ -894,16 +870,7 @@
           <w:sz w:val="24"/>
           <w:szCs w:val="24"/>
         </w:rPr>
-        <w:t xml:space="preserve">Falta de soluções acessíveis e intuitivas para </w:t>
-      </w:r>
-      <w:proofErr w:type="spellStart"/>
-      <w:r>
-        <w:rPr>
-          <w:rFonts w:ascii="Times New Roman" w:hAnsi="Times New Roman" w:cs="Times New Roman"/>
-          <w:sz w:val="24"/>
-          <w:szCs w:val="24"/>
-        </w:rPr>
-        <w:t>PME</w:t>
+        <w:t>Falta de soluções acessíveis e intuitivas para PME</w:t>
       </w:r>
       <w:r>
         <w:rPr>
@@ -919,23 +886,15 @@
           <w:sz w:val="24"/>
           <w:szCs w:val="24"/>
         </w:rPr>
-        <w:t>s</w:t>
-      </w:r>
-      <w:proofErr w:type="spellEnd"/>
-      <w:r>
-        <w:rPr>
-          <w:rFonts w:ascii="Times New Roman" w:hAnsi="Times New Roman" w:cs="Times New Roman"/>
-          <w:sz w:val="24"/>
-          <w:szCs w:val="24"/>
-        </w:rPr>
-        <w:t>, combinando facturação e controlo de stock.</w:t>
-      </w:r>
-    </w:p>
-    <w:p>
-      <w:pPr>
+        <w:t>s, combinando facturação e controlo de stock.</w:t>
+      </w:r>
+    </w:p>
+    <w:p>
+      <w:pPr>
+        <w:pStyle w:val="ListParagraph"/>
         <w:numPr>
           <w:ilvl w:val="0"/>
-          <w:numId w:val="25"/>
+          <w:numId w:val="35"/>
         </w:numPr>
         <w:spacing w:line="360" w:lineRule="auto"/>
         <w:jc w:val="both"/>
@@ -956,9 +915,10 @@
     </w:p>
     <w:p>
       <w:pPr>
+        <w:pStyle w:val="ListParagraph"/>
         <w:numPr>
           <w:ilvl w:val="0"/>
-          <w:numId w:val="25"/>
+          <w:numId w:val="35"/>
         </w:numPr>
         <w:spacing w:line="360" w:lineRule="auto"/>
         <w:jc w:val="both"/>
@@ -2191,25 +2151,7 @@
           <w:sz w:val="24"/>
           <w:szCs w:val="24"/>
         </w:rPr>
-        <w:t xml:space="preserve">Do ponto de vista operacional, o sistema foi concebido para </w:t>
-      </w:r>
-      <w:proofErr w:type="spellStart"/>
-      <w:r>
-        <w:rPr>
-          <w:rFonts w:ascii="Times New Roman" w:hAnsi="Times New Roman" w:cs="Times New Roman"/>
-          <w:sz w:val="24"/>
-          <w:szCs w:val="24"/>
-        </w:rPr>
-        <w:t>reflectir</w:t>
-      </w:r>
-      <w:proofErr w:type="spellEnd"/>
-      <w:r>
-        <w:rPr>
-          <w:rFonts w:ascii="Times New Roman" w:hAnsi="Times New Roman" w:cs="Times New Roman"/>
-          <w:sz w:val="24"/>
-          <w:szCs w:val="24"/>
-        </w:rPr>
-        <w:t xml:space="preserve"> os fluxos de trabalho existentes nas empresas moçambicanas, como o registo de vendas, emissão de facturas, gestão de entradas e saídas de stock, controlo de pagamentos e acompanhamento de dívidas. A integração entre facturação e stock permite que as operações sejam realizadas de forma automática e consistente, reduzindo tarefas manuais repetitivas e minimizando erros humanos, o que aumenta a eficiência operacional.</w:t>
+        <w:t>Do ponto de vista operacional, o sistema foi concebido para reflectir os fluxos de trabalho existentes nas empresas moçambicanas, como o registo de vendas, emissão de facturas, gestão de entradas e saídas de stock, controlo de pagamentos e acompanhamento de dívidas. A integração entre facturação e stock permite que as operações sejam realizadas de forma automática e consistente, reduzindo tarefas manuais repetitivas e minimizando erros humanos, o que aumenta a eficiência operacional.</w:t>
       </w:r>
     </w:p>
     <w:p>
@@ -2309,16 +2251,14 @@
         </w:rPr>
         <w:t xml:space="preserve">Do ponto de vista organizacional, a viabilidade operacional é reforçada pela facilidade de adopção do sistema, exigindo apenas formação básica para os utilizadores finais. A transição de processos manuais ou </w:t>
       </w:r>
-      <w:proofErr w:type="spellStart"/>
-      <w:r>
-        <w:rPr>
-          <w:rFonts w:ascii="Times New Roman" w:hAnsi="Times New Roman" w:cs="Times New Roman"/>
-          <w:sz w:val="24"/>
-          <w:szCs w:val="24"/>
-        </w:rPr>
-        <w:t>semi-automatizados</w:t>
-      </w:r>
-      <w:proofErr w:type="spellEnd"/>
+      <w:r>
+        <w:rPr>
+          <w:rFonts w:ascii="Times New Roman" w:hAnsi="Times New Roman" w:cs="Times New Roman"/>
+          <w:sz w:val="24"/>
+          <w:szCs w:val="24"/>
+        </w:rPr>
+        <w:t>semiautomáticos</w:t>
+      </w:r>
       <w:r>
         <w:rPr>
           <w:rFonts w:ascii="Times New Roman" w:hAnsi="Times New Roman" w:cs="Times New Roman"/>
@@ -2474,6 +2414,23 @@
     </w:p>
     <w:p>
       <w:pPr>
+        <w:rPr>
+          <w:rFonts w:ascii="Times New Roman" w:hAnsi="Times New Roman" w:cs="Times New Roman"/>
+          <w:sz w:val="24"/>
+          <w:szCs w:val="24"/>
+        </w:rPr>
+      </w:pPr>
+      <w:r>
+        <w:rPr>
+          <w:rFonts w:ascii="Times New Roman" w:hAnsi="Times New Roman" w:cs="Times New Roman"/>
+          <w:sz w:val="24"/>
+          <w:szCs w:val="24"/>
+        </w:rPr>
+        <w:br w:type="page"/>
+      </w:r>
+    </w:p>
+    <w:p>
+      <w:pPr>
         <w:spacing w:line="360" w:lineRule="auto"/>
         <w:jc w:val="both"/>
         <w:rPr>
@@ -2492,6 +2449,7 @@
           <w:sz w:val="24"/>
           <w:szCs w:val="24"/>
         </w:rPr>
+        <w:lastRenderedPageBreak/>
         <w:t>Viabilidade Temporal</w:t>
       </w:r>
     </w:p>
@@ -2511,7 +2469,6 @@
           <w:sz w:val="24"/>
           <w:szCs w:val="24"/>
         </w:rPr>
-        <w:lastRenderedPageBreak/>
         <w:t xml:space="preserve">A utilização de tecnologias consolidadas, como Java, </w:t>
       </w:r>
       <w:r>
@@ -2586,16 +2543,14 @@
         </w:rPr>
         <w:t xml:space="preserve">simplifica a arquitectura, diminuindo a complexidade da implementação e os prazos associados à configuração de </w:t>
       </w:r>
-      <w:proofErr w:type="spellStart"/>
-      <w:r>
-        <w:rPr>
-          <w:rFonts w:ascii="Times New Roman" w:hAnsi="Times New Roman" w:cs="Times New Roman"/>
-          <w:sz w:val="24"/>
-          <w:szCs w:val="24"/>
-        </w:rPr>
-        <w:t>infra-estruturas</w:t>
-      </w:r>
-      <w:proofErr w:type="spellEnd"/>
+      <w:r>
+        <w:rPr>
+          <w:rFonts w:ascii="Times New Roman" w:hAnsi="Times New Roman" w:cs="Times New Roman"/>
+          <w:sz w:val="24"/>
+          <w:szCs w:val="24"/>
+        </w:rPr>
+        <w:t>infraestruturas</w:t>
+      </w:r>
       <w:r>
         <w:rPr>
           <w:rFonts w:ascii="Times New Roman" w:hAnsi="Times New Roman" w:cs="Times New Roman"/>
@@ -2854,149 +2809,7 @@
           <w:sz w:val="24"/>
           <w:szCs w:val="24"/>
         </w:rPr>
-        <w:t xml:space="preserve">O presente estudo de viabilidade avaliou </w:t>
-      </w:r>
-      <w:r>
-        <w:rPr>
-          <w:rFonts w:ascii="Times New Roman" w:hAnsi="Times New Roman" w:cs="Times New Roman"/>
-          <w:sz w:val="24"/>
-          <w:szCs w:val="24"/>
-        </w:rPr>
-        <w:t>a adopção e implementação de um sistema de facturação e controlo de stock para empresas moçambicanas, com o objetivo de determinar se a solução atende às necessidades</w:t>
-      </w:r>
-      <w:r>
-        <w:rPr>
-          <w:rFonts w:ascii="Times New Roman" w:hAnsi="Times New Roman" w:cs="Times New Roman"/>
-          <w:sz w:val="24"/>
-          <w:szCs w:val="24"/>
-        </w:rPr>
-        <w:t xml:space="preserve"> funcionais, técnicas, operacionais, legais e económicas da organizações moçambicanas.</w:t>
-      </w:r>
-    </w:p>
-    <w:p>
-      <w:pPr>
-        <w:spacing w:line="360" w:lineRule="auto"/>
-        <w:jc w:val="both"/>
-        <w:rPr>
-          <w:rFonts w:ascii="Times New Roman" w:hAnsi="Times New Roman" w:cs="Times New Roman"/>
-          <w:sz w:val="24"/>
-          <w:szCs w:val="24"/>
-        </w:rPr>
-      </w:pPr>
-      <w:r>
-        <w:rPr>
-          <w:rFonts w:ascii="Times New Roman" w:hAnsi="Times New Roman" w:cs="Times New Roman"/>
-          <w:sz w:val="24"/>
-          <w:szCs w:val="24"/>
-        </w:rPr>
-        <w:t>O sistema proposto permite registar vendas, emitir facturas, controlar entradas e saídas de stock e actualizar automaticamente as quantidades disponíveis em armazém. A integração entre facturação e stock garante consistência das operações, enquanto funcionalidades avançadas permitem gerir pagamentos, controlar dívidas, acompanhar caixa e gerar relatórios detalhados sobre vendas, stock e desempenho financeiro. O software suporta múltiplos armazéns e empresas, configuração de impostos, integração com outros sistemas e exportação de dados para fins contabilísticos, oferecendo uma visão estratégica e confiável das operações comerciais.</w:t>
-      </w:r>
-    </w:p>
-    <w:p>
-      <w:pPr>
-        <w:spacing w:line="360" w:lineRule="auto"/>
-        <w:jc w:val="both"/>
-        <w:rPr>
-          <w:rFonts w:ascii="Times New Roman" w:hAnsi="Times New Roman" w:cs="Times New Roman"/>
-          <w:sz w:val="24"/>
-          <w:szCs w:val="24"/>
-        </w:rPr>
-      </w:pPr>
-      <w:r>
-        <w:rPr>
-          <w:rFonts w:ascii="Times New Roman" w:hAnsi="Times New Roman" w:cs="Times New Roman"/>
-          <w:sz w:val="24"/>
-          <w:szCs w:val="24"/>
-        </w:rPr>
-        <w:t>O desenvolvimento do sistema baseia</w:t>
-      </w:r>
-      <w:r>
-        <w:rPr>
-          <w:rFonts w:ascii="Times New Roman" w:hAnsi="Times New Roman" w:cs="Times New Roman"/>
-          <w:sz w:val="24"/>
-          <w:szCs w:val="24"/>
-        </w:rPr>
-        <w:t>-se em tecnologias consolidadas e confiáveis,</w:t>
-      </w:r>
-      <w:r>
-        <w:rPr>
-          <w:rFonts w:ascii="Times New Roman" w:hAnsi="Times New Roman" w:cs="Times New Roman"/>
-          <w:sz w:val="24"/>
-          <w:szCs w:val="24"/>
-        </w:rPr>
-        <w:t xml:space="preserve"> como </w:t>
-      </w:r>
-      <w:r>
-        <w:rPr>
-          <w:rFonts w:ascii="Times New Roman" w:hAnsi="Times New Roman" w:cs="Times New Roman"/>
-          <w:sz w:val="24"/>
-          <w:szCs w:val="24"/>
-        </w:rPr>
-        <w:t>JAVA</w:t>
-      </w:r>
-      <w:r>
-        <w:rPr>
-          <w:rFonts w:ascii="Times New Roman" w:hAnsi="Times New Roman" w:cs="Times New Roman"/>
-          <w:sz w:val="24"/>
-          <w:szCs w:val="24"/>
-        </w:rPr>
-        <w:t xml:space="preserve">, </w:t>
-      </w:r>
-      <w:r>
-        <w:rPr>
-          <w:rFonts w:ascii="Times New Roman" w:hAnsi="Times New Roman" w:cs="Times New Roman"/>
-          <w:sz w:val="24"/>
-          <w:szCs w:val="24"/>
-        </w:rPr>
-        <w:t>JAVAFX</w:t>
-      </w:r>
-      <w:r>
-        <w:rPr>
-          <w:rFonts w:ascii="Times New Roman" w:hAnsi="Times New Roman" w:cs="Times New Roman"/>
-          <w:sz w:val="24"/>
-          <w:szCs w:val="24"/>
-        </w:rPr>
-        <w:t xml:space="preserve">, </w:t>
-      </w:r>
-      <w:r>
-        <w:rPr>
-          <w:rFonts w:ascii="Times New Roman" w:hAnsi="Times New Roman" w:cs="Times New Roman"/>
-          <w:sz w:val="24"/>
-          <w:szCs w:val="24"/>
-        </w:rPr>
-        <w:t>MYSQL</w:t>
-      </w:r>
-      <w:r>
-        <w:rPr>
-          <w:rFonts w:ascii="Times New Roman" w:hAnsi="Times New Roman" w:cs="Times New Roman"/>
-          <w:sz w:val="24"/>
-          <w:szCs w:val="24"/>
-        </w:rPr>
-        <w:t xml:space="preserve">, JDBC e </w:t>
-      </w:r>
-      <w:r>
-        <w:rPr>
-          <w:rFonts w:ascii="Times New Roman" w:hAnsi="Times New Roman" w:cs="Times New Roman"/>
-          <w:sz w:val="24"/>
-          <w:szCs w:val="24"/>
-        </w:rPr>
-        <w:t xml:space="preserve">ITEXT </w:t>
-      </w:r>
-      <w:r>
-        <w:rPr>
-          <w:rFonts w:ascii="Times New Roman" w:hAnsi="Times New Roman" w:cs="Times New Roman"/>
-          <w:sz w:val="24"/>
-          <w:szCs w:val="24"/>
-        </w:rPr>
-        <w:t xml:space="preserve">7, garantindo estabilidade, portabilidade, interface intuitiva, persistência segura de dados e geração profissional de relatórios em PDF. A solução </w:t>
-      </w:r>
-      <w:r>
-        <w:rPr>
-          <w:rFonts w:ascii="Times New Roman" w:hAnsi="Times New Roman" w:cs="Times New Roman"/>
-          <w:sz w:val="24"/>
-          <w:szCs w:val="24"/>
-        </w:rPr>
-        <w:t>STAND ALONE</w:t>
+        <w:t>Este resumo executivo sintetiza as análises detalhadas apresentadas nas secções</w:t>
       </w:r>
       <w:r>
         <w:rPr>
@@ -3009,67 +2822,38 @@
       <w:r>
         <w:rPr>
           <w:rFonts w:ascii="Times New Roman" w:hAnsi="Times New Roman" w:cs="Times New Roman"/>
-          <w:sz w:val="24"/>
-          <w:szCs w:val="24"/>
-        </w:rPr>
-        <w:t>assegura operação independente da Internet, permitindo continuidade das operações mesmo em ambientes com conectividade limitada.</w:t>
-      </w:r>
-    </w:p>
-    <w:p>
-      <w:pPr>
-        <w:spacing w:line="360" w:lineRule="auto"/>
-        <w:jc w:val="both"/>
-        <w:rPr>
-          <w:rFonts w:ascii="Times New Roman" w:hAnsi="Times New Roman" w:cs="Times New Roman"/>
-          <w:sz w:val="24"/>
-          <w:szCs w:val="24"/>
-        </w:rPr>
-      </w:pPr>
-      <w:r>
-        <w:rPr>
-          <w:rFonts w:ascii="Times New Roman" w:hAnsi="Times New Roman" w:cs="Times New Roman"/>
-          <w:sz w:val="24"/>
-          <w:szCs w:val="24"/>
-        </w:rPr>
-        <w:t>Do ponto de vista económico, os custos de desenvolvimento, implementação e manutenção são compatíveis com os benefícios esperados, incluindo maior eficiência operacional, redução de erros, controlo de stock, otimização do tempo dos colaboradores e melhor tomada de decisões estratégicas, promovendo sustentabilidade financeira a médio e longo prazo.</w:t>
-      </w:r>
-    </w:p>
-    <w:p>
-      <w:pPr>
-        <w:spacing w:line="360" w:lineRule="auto"/>
-        <w:jc w:val="both"/>
-        <w:rPr>
-          <w:rFonts w:ascii="Times New Roman" w:hAnsi="Times New Roman" w:cs="Times New Roman"/>
-          <w:sz w:val="24"/>
-          <w:szCs w:val="24"/>
-        </w:rPr>
-      </w:pPr>
-      <w:r>
-        <w:rPr>
-          <w:rFonts w:ascii="Times New Roman" w:hAnsi="Times New Roman" w:cs="Times New Roman"/>
-          <w:sz w:val="24"/>
-          <w:szCs w:val="24"/>
-        </w:rPr>
-        <w:t>A solução adapta-se aos fluxos de trabalho existentes, é intuitiva, segura, permite controlo de acessos e proteção de dados, e cumpre os requisitos legais e fiscais aplicáveis. O planeamento estruturado do desenvolvimento, aliado à experiência técnica da equipa, garante que o sistema possa ser implementado dentro de prazos realistas, minimizando riscos e interrupções operacionais.</w:t>
-      </w:r>
-    </w:p>
-    <w:p>
-      <w:pPr>
-        <w:spacing w:line="360" w:lineRule="auto"/>
-        <w:jc w:val="both"/>
-        <w:rPr>
-          <w:rFonts w:ascii="Times New Roman" w:hAnsi="Times New Roman" w:cs="Times New Roman"/>
-          <w:sz w:val="24"/>
-          <w:szCs w:val="24"/>
-        </w:rPr>
-      </w:pPr>
-      <w:r>
-        <w:rPr>
-          <w:rFonts w:ascii="Times New Roman" w:hAnsi="Times New Roman" w:cs="Times New Roman"/>
-          <w:sz w:val="24"/>
-          <w:szCs w:val="24"/>
-        </w:rPr>
-        <w:lastRenderedPageBreak/>
+          <w:i/>
+          <w:iCs/>
+          <w:sz w:val="24"/>
+          <w:szCs w:val="24"/>
+        </w:rPr>
+        <w:t>“Análise de Viabilidade”</w:t>
+      </w:r>
+      <w:r>
+        <w:rPr>
+          <w:rFonts w:ascii="Times New Roman" w:hAnsi="Times New Roman" w:cs="Times New Roman"/>
+          <w:sz w:val="24"/>
+          <w:szCs w:val="24"/>
+        </w:rPr>
+        <w:t xml:space="preserve"> e respectivas subseções (técnica, económica, operacional, legal e temporal), consolidando os principais resultados e conclusões do estudo sem introduzir novos elementos funcionais ou técnicos.</w:t>
+      </w:r>
+    </w:p>
+    <w:p>
+      <w:pPr>
+        <w:spacing w:line="360" w:lineRule="auto"/>
+        <w:jc w:val="both"/>
+        <w:rPr>
+          <w:rFonts w:ascii="Times New Roman" w:hAnsi="Times New Roman" w:cs="Times New Roman"/>
+          <w:sz w:val="24"/>
+          <w:szCs w:val="24"/>
+        </w:rPr>
+      </w:pPr>
+      <w:r>
+        <w:rPr>
+          <w:rFonts w:ascii="Times New Roman" w:hAnsi="Times New Roman" w:cs="Times New Roman"/>
+          <w:sz w:val="24"/>
+          <w:szCs w:val="24"/>
+        </w:rPr>
         <w:t>Em síntese, o sistema de facturação e controlo de stock apresenta-</w:t>
       </w:r>
       <w:r>
@@ -3123,7 +2907,6 @@
         </w:rPr>
         <w:br w:type="page"/>
       </w:r>
-      <w:proofErr w:type="spellStart"/>
       <w:r>
         <w:rPr>
           <w:rFonts w:ascii="Times New Roman" w:hAnsi="Times New Roman" w:cs="Times New Roman"/>
@@ -3133,18 +2916,7 @@
           <w:szCs w:val="24"/>
         </w:rPr>
         <w:lastRenderedPageBreak/>
-        <w:t>Elicitação</w:t>
-      </w:r>
-      <w:proofErr w:type="spellEnd"/>
-      <w:r>
-        <w:rPr>
-          <w:rFonts w:ascii="Times New Roman" w:hAnsi="Times New Roman" w:cs="Times New Roman"/>
-          <w:b/>
-          <w:bCs/>
-          <w:sz w:val="24"/>
-          <w:szCs w:val="24"/>
-        </w:rPr>
-        <w:t xml:space="preserve"> e Análise de Requisitos</w:t>
+        <w:t>Elicitação e Análise de Requisitos</w:t>
       </w:r>
     </w:p>
     <w:p>
@@ -3218,163 +2990,39 @@
     </w:p>
     <w:p>
       <w:pPr>
-        <w:numPr>
-          <w:ilvl w:val="0"/>
-          <w:numId w:val="24"/>
-        </w:numPr>
-        <w:spacing w:line="360" w:lineRule="auto"/>
-        <w:jc w:val="both"/>
-        <w:rPr>
-          <w:rFonts w:ascii="Times New Roman" w:hAnsi="Times New Roman" w:cs="Times New Roman"/>
-          <w:sz w:val="24"/>
-          <w:szCs w:val="24"/>
-        </w:rPr>
-      </w:pPr>
-      <w:r>
-        <w:rPr>
-          <w:rFonts w:ascii="Times New Roman" w:hAnsi="Times New Roman" w:cs="Times New Roman"/>
-          <w:sz w:val="24"/>
-          <w:szCs w:val="24"/>
-        </w:rPr>
-        <w:t>Controle confiável de entradas e saídas de stock.</w:t>
-      </w:r>
-    </w:p>
-    <w:p>
-      <w:pPr>
-        <w:numPr>
-          <w:ilvl w:val="0"/>
-          <w:numId w:val="24"/>
-        </w:numPr>
-        <w:spacing w:line="360" w:lineRule="auto"/>
-        <w:jc w:val="both"/>
-        <w:rPr>
-          <w:rFonts w:ascii="Times New Roman" w:hAnsi="Times New Roman" w:cs="Times New Roman"/>
-          <w:sz w:val="24"/>
-          <w:szCs w:val="24"/>
-        </w:rPr>
-      </w:pPr>
-      <w:r>
-        <w:rPr>
-          <w:rFonts w:ascii="Times New Roman" w:hAnsi="Times New Roman" w:cs="Times New Roman"/>
-          <w:sz w:val="24"/>
-          <w:szCs w:val="24"/>
-        </w:rPr>
-        <w:t>Emissão de facturas eletrónicas e conformidade fiscal.</w:t>
-      </w:r>
-    </w:p>
-    <w:p>
-      <w:pPr>
-        <w:numPr>
-          <w:ilvl w:val="0"/>
-          <w:numId w:val="24"/>
-        </w:numPr>
-        <w:spacing w:line="360" w:lineRule="auto"/>
-        <w:jc w:val="both"/>
-        <w:rPr>
-          <w:rFonts w:ascii="Times New Roman" w:hAnsi="Times New Roman" w:cs="Times New Roman"/>
-          <w:sz w:val="24"/>
-          <w:szCs w:val="24"/>
-        </w:rPr>
-      </w:pPr>
-      <w:r>
-        <w:rPr>
-          <w:rFonts w:ascii="Times New Roman" w:hAnsi="Times New Roman" w:cs="Times New Roman"/>
-          <w:sz w:val="24"/>
-          <w:szCs w:val="24"/>
-        </w:rPr>
-        <w:t>Relatórios financeiros e de desempenho em tempo real.</w:t>
-      </w:r>
-    </w:p>
-    <w:p>
-      <w:pPr>
-        <w:numPr>
-          <w:ilvl w:val="0"/>
-          <w:numId w:val="24"/>
-        </w:numPr>
-        <w:spacing w:line="360" w:lineRule="auto"/>
-        <w:jc w:val="both"/>
-        <w:rPr>
-          <w:rFonts w:ascii="Times New Roman" w:hAnsi="Times New Roman" w:cs="Times New Roman"/>
-          <w:sz w:val="24"/>
-          <w:szCs w:val="24"/>
-        </w:rPr>
-      </w:pPr>
-      <w:r>
-        <w:rPr>
-          <w:rFonts w:ascii="Times New Roman" w:hAnsi="Times New Roman" w:cs="Times New Roman"/>
-          <w:sz w:val="24"/>
-          <w:szCs w:val="24"/>
-        </w:rPr>
-        <w:t>Gestão integrada de múltiplos armazéns e filiais.</w:t>
-      </w:r>
-    </w:p>
-    <w:p>
-      <w:pPr>
-        <w:numPr>
-          <w:ilvl w:val="0"/>
-          <w:numId w:val="24"/>
-        </w:numPr>
-        <w:spacing w:line="360" w:lineRule="auto"/>
-        <w:jc w:val="both"/>
-        <w:rPr>
-          <w:rFonts w:ascii="Times New Roman" w:hAnsi="Times New Roman" w:cs="Times New Roman"/>
-          <w:sz w:val="24"/>
-          <w:szCs w:val="24"/>
-        </w:rPr>
-      </w:pPr>
-      <w:r>
-        <w:rPr>
-          <w:rFonts w:ascii="Times New Roman" w:hAnsi="Times New Roman" w:cs="Times New Roman"/>
-          <w:sz w:val="24"/>
-          <w:szCs w:val="24"/>
-        </w:rPr>
-        <w:t>Facilidade de utilização por operadores com conhecimento informático básico.</w:t>
-      </w:r>
-    </w:p>
-    <w:p>
-      <w:pPr>
-        <w:numPr>
-          <w:ilvl w:val="0"/>
-          <w:numId w:val="24"/>
-        </w:numPr>
-        <w:spacing w:line="360" w:lineRule="auto"/>
-        <w:jc w:val="both"/>
-        <w:rPr>
-          <w:rFonts w:ascii="Times New Roman" w:hAnsi="Times New Roman" w:cs="Times New Roman"/>
-          <w:sz w:val="24"/>
-          <w:szCs w:val="24"/>
-        </w:rPr>
-      </w:pPr>
-      <w:r>
-        <w:rPr>
-          <w:rFonts w:ascii="Times New Roman" w:hAnsi="Times New Roman" w:cs="Times New Roman"/>
-          <w:sz w:val="24"/>
-          <w:szCs w:val="24"/>
-        </w:rPr>
-        <w:t>Redução de erros humanos e otimização do tempo dos colaboradores.</w:t>
-      </w:r>
-    </w:p>
-    <w:p>
-      <w:pPr>
-        <w:numPr>
-          <w:ilvl w:val="0"/>
-          <w:numId w:val="24"/>
-        </w:numPr>
-        <w:spacing w:line="360" w:lineRule="auto"/>
-        <w:jc w:val="both"/>
-        <w:rPr>
-          <w:rFonts w:ascii="Times New Roman" w:hAnsi="Times New Roman" w:cs="Times New Roman"/>
-          <w:sz w:val="24"/>
-          <w:szCs w:val="24"/>
-        </w:rPr>
-      </w:pPr>
-      <w:r>
-        <w:rPr>
-          <w:rFonts w:ascii="Times New Roman" w:hAnsi="Times New Roman" w:cs="Times New Roman"/>
-          <w:sz w:val="24"/>
-          <w:szCs w:val="24"/>
-        </w:rPr>
-        <w:t>Segurança da informação e controlo de acessos.</w:t>
+        <w:spacing w:line="360" w:lineRule="auto"/>
+        <w:jc w:val="both"/>
+        <w:rPr>
+          <w:rFonts w:ascii="Times New Roman" w:hAnsi="Times New Roman" w:cs="Times New Roman"/>
+          <w:sz w:val="24"/>
+          <w:szCs w:val="24"/>
+        </w:rPr>
+      </w:pPr>
+      <w:r>
+        <w:rPr>
+          <w:rFonts w:ascii="Times New Roman" w:hAnsi="Times New Roman" w:cs="Times New Roman"/>
+          <w:sz w:val="24"/>
+          <w:szCs w:val="24"/>
+        </w:rPr>
+        <w:t xml:space="preserve">As necessidades identificadas nesta fase correspondem às mesmas necessidades levantadas no Estudo de Mercado e Análise de Concorrência, apresentadas na secção </w:t>
+      </w:r>
+      <w:r>
+        <w:rPr>
+          <w:rFonts w:ascii="Times New Roman" w:hAnsi="Times New Roman" w:cs="Times New Roman"/>
+          <w:i/>
+          <w:iCs/>
+          <w:sz w:val="24"/>
+          <w:szCs w:val="24"/>
+        </w:rPr>
+        <w:t>“Necessidades do Mercado”</w:t>
+      </w:r>
+      <w:r>
+        <w:rPr>
+          <w:rFonts w:ascii="Times New Roman" w:hAnsi="Times New Roman" w:cs="Times New Roman"/>
+          <w:sz w:val="24"/>
+          <w:szCs w:val="24"/>
+        </w:rPr>
+        <w:t>, nomeadamente no que respeita ao controlo de stock, facturação electrónica, relatórios de gestão, segurança da informação e facilidade de utilização por operadores com conhecimentos informáticos básicos.</w:t>
       </w:r>
     </w:p>
     <w:p>
@@ -3402,208 +3050,80 @@
     </w:p>
     <w:p>
       <w:pPr>
-        <w:numPr>
-          <w:ilvl w:val="0"/>
-          <w:numId w:val="26"/>
-        </w:numPr>
-        <w:spacing w:line="360" w:lineRule="auto"/>
-        <w:jc w:val="both"/>
-        <w:rPr>
-          <w:rFonts w:ascii="Times New Roman" w:hAnsi="Times New Roman" w:cs="Times New Roman"/>
-          <w:sz w:val="24"/>
-          <w:szCs w:val="24"/>
-        </w:rPr>
-      </w:pPr>
-      <w:r>
-        <w:rPr>
-          <w:rFonts w:ascii="Times New Roman" w:hAnsi="Times New Roman" w:cs="Times New Roman"/>
-          <w:sz w:val="24"/>
-          <w:szCs w:val="24"/>
-        </w:rPr>
-        <w:t>Registo e emissão de facturas e recibos.</w:t>
-      </w:r>
-    </w:p>
-    <w:p>
-      <w:pPr>
-        <w:numPr>
-          <w:ilvl w:val="0"/>
-          <w:numId w:val="26"/>
-        </w:numPr>
-        <w:spacing w:line="360" w:lineRule="auto"/>
-        <w:jc w:val="both"/>
-        <w:rPr>
-          <w:rFonts w:ascii="Times New Roman" w:hAnsi="Times New Roman" w:cs="Times New Roman"/>
-          <w:sz w:val="24"/>
-          <w:szCs w:val="24"/>
-        </w:rPr>
-      </w:pPr>
-      <w:r>
-        <w:rPr>
-          <w:rFonts w:ascii="Times New Roman" w:hAnsi="Times New Roman" w:cs="Times New Roman"/>
-          <w:sz w:val="24"/>
-          <w:szCs w:val="24"/>
-        </w:rPr>
-        <w:t>Gestão de entradas e saídas de stock, atualização automática de quantidades.</w:t>
-      </w:r>
-    </w:p>
-    <w:p>
-      <w:pPr>
-        <w:numPr>
-          <w:ilvl w:val="0"/>
-          <w:numId w:val="26"/>
-        </w:numPr>
-        <w:spacing w:line="360" w:lineRule="auto"/>
-        <w:jc w:val="both"/>
-        <w:rPr>
-          <w:rFonts w:ascii="Times New Roman" w:hAnsi="Times New Roman" w:cs="Times New Roman"/>
-          <w:sz w:val="24"/>
-          <w:szCs w:val="24"/>
-        </w:rPr>
-      </w:pPr>
-      <w:r>
-        <w:rPr>
-          <w:rFonts w:ascii="Times New Roman" w:hAnsi="Times New Roman" w:cs="Times New Roman"/>
-          <w:sz w:val="24"/>
-          <w:szCs w:val="24"/>
-        </w:rPr>
-        <w:t>Controle de pagamentos, dívidas e contas correntes.</w:t>
-      </w:r>
-    </w:p>
-    <w:p>
-      <w:pPr>
-        <w:numPr>
-          <w:ilvl w:val="0"/>
-          <w:numId w:val="26"/>
-        </w:numPr>
-        <w:spacing w:line="360" w:lineRule="auto"/>
-        <w:jc w:val="both"/>
-        <w:rPr>
-          <w:rFonts w:ascii="Times New Roman" w:hAnsi="Times New Roman" w:cs="Times New Roman"/>
-          <w:sz w:val="24"/>
-          <w:szCs w:val="24"/>
-        </w:rPr>
-      </w:pPr>
-      <w:r>
-        <w:rPr>
-          <w:rFonts w:ascii="Times New Roman" w:hAnsi="Times New Roman" w:cs="Times New Roman"/>
-          <w:sz w:val="24"/>
-          <w:szCs w:val="24"/>
-        </w:rPr>
-        <w:t>Suporte para múltiplos armazéns e empresas.</w:t>
-      </w:r>
-    </w:p>
-    <w:p>
-      <w:pPr>
-        <w:numPr>
-          <w:ilvl w:val="0"/>
-          <w:numId w:val="26"/>
-        </w:numPr>
-        <w:spacing w:line="360" w:lineRule="auto"/>
-        <w:jc w:val="both"/>
-        <w:rPr>
-          <w:rFonts w:ascii="Times New Roman" w:hAnsi="Times New Roman" w:cs="Times New Roman"/>
-          <w:sz w:val="24"/>
-          <w:szCs w:val="24"/>
-        </w:rPr>
-      </w:pPr>
-      <w:r>
-        <w:rPr>
-          <w:rFonts w:ascii="Times New Roman" w:hAnsi="Times New Roman" w:cs="Times New Roman"/>
-          <w:sz w:val="24"/>
-          <w:szCs w:val="24"/>
-        </w:rPr>
-        <w:t>Configuração de impostos e integração com sistemas contábeis.</w:t>
-      </w:r>
-    </w:p>
-    <w:p>
-      <w:pPr>
-        <w:numPr>
-          <w:ilvl w:val="0"/>
-          <w:numId w:val="26"/>
-        </w:numPr>
-        <w:spacing w:line="360" w:lineRule="auto"/>
-        <w:jc w:val="both"/>
-        <w:rPr>
-          <w:rFonts w:ascii="Times New Roman" w:hAnsi="Times New Roman" w:cs="Times New Roman"/>
-          <w:sz w:val="24"/>
-          <w:szCs w:val="24"/>
-        </w:rPr>
-      </w:pPr>
-      <w:r>
-        <w:rPr>
-          <w:rFonts w:ascii="Times New Roman" w:hAnsi="Times New Roman" w:cs="Times New Roman"/>
-          <w:sz w:val="24"/>
-          <w:szCs w:val="24"/>
-        </w:rPr>
-        <w:t>Relatórios detalhados de vendas, produtos, stock e desempenho financeiro.</w:t>
-      </w:r>
-    </w:p>
-    <w:p>
-      <w:pPr>
-        <w:numPr>
-          <w:ilvl w:val="0"/>
-          <w:numId w:val="26"/>
-        </w:numPr>
-        <w:spacing w:line="360" w:lineRule="auto"/>
-        <w:jc w:val="both"/>
-        <w:rPr>
-          <w:rFonts w:ascii="Times New Roman" w:hAnsi="Times New Roman" w:cs="Times New Roman"/>
-          <w:sz w:val="24"/>
-          <w:szCs w:val="24"/>
-        </w:rPr>
-      </w:pPr>
-      <w:r>
-        <w:rPr>
-          <w:rFonts w:ascii="Times New Roman" w:hAnsi="Times New Roman" w:cs="Times New Roman"/>
-          <w:sz w:val="24"/>
-          <w:szCs w:val="24"/>
-        </w:rPr>
-        <w:t>Perfis de utilizador, níveis de acesso e auditoria de operações.</w:t>
-      </w:r>
-    </w:p>
-    <w:p>
-      <w:pPr>
-        <w:numPr>
-          <w:ilvl w:val="0"/>
-          <w:numId w:val="26"/>
-        </w:numPr>
-        <w:spacing w:line="360" w:lineRule="auto"/>
-        <w:jc w:val="both"/>
-        <w:rPr>
-          <w:rFonts w:ascii="Times New Roman" w:hAnsi="Times New Roman" w:cs="Times New Roman"/>
-          <w:sz w:val="24"/>
-          <w:szCs w:val="24"/>
-        </w:rPr>
-      </w:pPr>
-      <w:r>
-        <w:rPr>
-          <w:rFonts w:ascii="Times New Roman" w:hAnsi="Times New Roman" w:cs="Times New Roman"/>
-          <w:sz w:val="24"/>
-          <w:szCs w:val="24"/>
-        </w:rPr>
-        <w:t xml:space="preserve">Operação </w:t>
-      </w:r>
-      <w:r>
-        <w:rPr>
-          <w:rFonts w:ascii="Times New Roman" w:hAnsi="Times New Roman" w:cs="Times New Roman"/>
-          <w:sz w:val="24"/>
-          <w:szCs w:val="24"/>
-        </w:rPr>
-        <w:t>STAND ALONE</w:t>
-      </w:r>
-      <w:r>
-        <w:rPr>
-          <w:rFonts w:ascii="Times New Roman" w:hAnsi="Times New Roman" w:cs="Times New Roman"/>
-          <w:sz w:val="24"/>
-          <w:szCs w:val="24"/>
-        </w:rPr>
-        <w:t>, independente da internet.</w:t>
-      </w:r>
-    </w:p>
-    <w:p>
-      <w:pPr>
-        <w:spacing w:line="360" w:lineRule="auto"/>
-        <w:jc w:val="both"/>
+        <w:spacing w:line="360" w:lineRule="auto"/>
+        <w:jc w:val="both"/>
+        <w:rPr>
+          <w:rFonts w:ascii="Times New Roman" w:hAnsi="Times New Roman" w:cs="Times New Roman"/>
+          <w:sz w:val="24"/>
+          <w:szCs w:val="24"/>
+        </w:rPr>
+      </w:pPr>
+      <w:r>
+        <w:rPr>
+          <w:rFonts w:ascii="Times New Roman" w:hAnsi="Times New Roman" w:cs="Times New Roman"/>
+          <w:sz w:val="24"/>
+          <w:szCs w:val="24"/>
+        </w:rPr>
+        <w:t xml:space="preserve">Os requisitos identificados resultam directamente das necessidades do mercado e das oportunidades descritas nas secções </w:t>
+      </w:r>
+      <w:r>
+        <w:rPr>
+          <w:rFonts w:ascii="Times New Roman" w:hAnsi="Times New Roman" w:cs="Times New Roman"/>
+          <w:i/>
+          <w:iCs/>
+          <w:sz w:val="24"/>
+          <w:szCs w:val="24"/>
+        </w:rPr>
+        <w:t>“Necessidades do Mercado”</w:t>
+      </w:r>
+      <w:r>
+        <w:rPr>
+          <w:rFonts w:ascii="Times New Roman" w:hAnsi="Times New Roman" w:cs="Times New Roman"/>
+          <w:sz w:val="24"/>
+          <w:szCs w:val="24"/>
+        </w:rPr>
+        <w:t xml:space="preserve"> e </w:t>
+      </w:r>
+      <w:r>
+        <w:rPr>
+          <w:rFonts w:ascii="Times New Roman" w:hAnsi="Times New Roman" w:cs="Times New Roman"/>
+          <w:i/>
+          <w:iCs/>
+          <w:sz w:val="24"/>
+          <w:szCs w:val="24"/>
+        </w:rPr>
+        <w:t>“Oportunidades Identificadas”</w:t>
+      </w:r>
+      <w:r>
+        <w:rPr>
+          <w:rFonts w:ascii="Times New Roman" w:hAnsi="Times New Roman" w:cs="Times New Roman"/>
+          <w:sz w:val="24"/>
+          <w:szCs w:val="24"/>
+        </w:rPr>
+        <w:t xml:space="preserve">, bem como da </w:t>
+      </w:r>
+      <w:r>
+        <w:rPr>
+          <w:rFonts w:ascii="Times New Roman" w:hAnsi="Times New Roman" w:cs="Times New Roman"/>
+          <w:i/>
+          <w:iCs/>
+          <w:sz w:val="24"/>
+          <w:szCs w:val="24"/>
+        </w:rPr>
+        <w:t>Descrição do Sistema Proposto</w:t>
+      </w:r>
+      <w:r>
+        <w:rPr>
+          <w:rFonts w:ascii="Times New Roman" w:hAnsi="Times New Roman" w:cs="Times New Roman"/>
+          <w:sz w:val="24"/>
+          <w:szCs w:val="24"/>
+        </w:rPr>
+        <w:t>. Estes requisitos representam uma consolidação inicial das funcionalidades essenciais esperadas do sistema, a serem posteriormente refinadas e formalizadas na Especificação de Requisitos de Software (SRS).</w:t>
+      </w:r>
+    </w:p>
+    <w:p>
+      <w:pPr>
+        <w:spacing w:line="360" w:lineRule="auto"/>
         <w:rPr>
           <w:rFonts w:ascii="Times New Roman" w:hAnsi="Times New Roman" w:cs="Times New Roman"/>
           <w:b/>
@@ -3612,10 +3132,7 @@
           <w:szCs w:val="24"/>
         </w:rPr>
       </w:pPr>
-    </w:p>
-    <w:p>
-      <w:pPr>
-        <w:spacing w:line="360" w:lineRule="auto"/>
+      <w:r>
         <w:rPr>
           <w:rFonts w:ascii="Times New Roman" w:hAnsi="Times New Roman" w:cs="Times New Roman"/>
           <w:b/>
@@ -3623,8 +3140,13 @@
           <w:sz w:val="24"/>
           <w:szCs w:val="24"/>
         </w:rPr>
-      </w:pPr>
-      <w:r>
+        <w:br w:type="page"/>
+      </w:r>
+    </w:p>
+    <w:p>
+      <w:pPr>
+        <w:spacing w:line="360" w:lineRule="auto"/>
+        <w:jc w:val="both"/>
         <w:rPr>
           <w:rFonts w:ascii="Times New Roman" w:hAnsi="Times New Roman" w:cs="Times New Roman"/>
           <w:b/>
@@ -3632,13 +3154,8 @@
           <w:sz w:val="24"/>
           <w:szCs w:val="24"/>
         </w:rPr>
-        <w:br w:type="page"/>
-      </w:r>
-    </w:p>
-    <w:p>
-      <w:pPr>
-        <w:spacing w:line="360" w:lineRule="auto"/>
-        <w:jc w:val="both"/>
+      </w:pPr>
+      <w:r>
         <w:rPr>
           <w:rFonts w:ascii="Times New Roman" w:hAnsi="Times New Roman" w:cs="Times New Roman"/>
           <w:b/>
@@ -3646,8 +3163,14 @@
           <w:sz w:val="24"/>
           <w:szCs w:val="24"/>
         </w:rPr>
-      </w:pPr>
-      <w:r>
+        <w:lastRenderedPageBreak/>
+        <w:t>Documentação de Requisitos (SRS – Software Requirements Specification)</w:t>
+      </w:r>
+    </w:p>
+    <w:p>
+      <w:pPr>
+        <w:spacing w:line="360" w:lineRule="auto"/>
+        <w:jc w:val="both"/>
         <w:rPr>
           <w:rFonts w:ascii="Times New Roman" w:hAnsi="Times New Roman" w:cs="Times New Roman"/>
           <w:b/>
@@ -3655,10 +3178,7 @@
           <w:sz w:val="24"/>
           <w:szCs w:val="24"/>
         </w:rPr>
-        <w:lastRenderedPageBreak/>
-        <w:t xml:space="preserve">Documentação de Requisitos (SRS – Software </w:t>
-      </w:r>
-      <w:proofErr w:type="spellStart"/>
+      </w:pPr>
       <w:r>
         <w:rPr>
           <w:rFonts w:ascii="Times New Roman" w:hAnsi="Times New Roman" w:cs="Times New Roman"/>
@@ -3667,10 +3187,13 @@
           <w:sz w:val="24"/>
           <w:szCs w:val="24"/>
         </w:rPr>
-        <w:t>Requirements</w:t>
-      </w:r>
-      <w:proofErr w:type="spellEnd"/>
-      <w:r>
+        <w:t>Introdução</w:t>
+      </w:r>
+    </w:p>
+    <w:p>
+      <w:pPr>
+        <w:spacing w:line="360" w:lineRule="auto"/>
+        <w:jc w:val="both"/>
         <w:rPr>
           <w:rFonts w:ascii="Times New Roman" w:hAnsi="Times New Roman" w:cs="Times New Roman"/>
           <w:b/>
@@ -3678,9 +3201,7 @@
           <w:sz w:val="24"/>
           <w:szCs w:val="24"/>
         </w:rPr>
-        <w:t xml:space="preserve"> </w:t>
-      </w:r>
-      <w:proofErr w:type="spellStart"/>
+      </w:pPr>
       <w:r>
         <w:rPr>
           <w:rFonts w:ascii="Times New Roman" w:hAnsi="Times New Roman" w:cs="Times New Roman"/>
@@ -3689,63 +3210,6 @@
           <w:sz w:val="24"/>
           <w:szCs w:val="24"/>
         </w:rPr>
-        <w:t>Specification</w:t>
-      </w:r>
-      <w:proofErr w:type="spellEnd"/>
-      <w:r>
-        <w:rPr>
-          <w:rFonts w:ascii="Times New Roman" w:hAnsi="Times New Roman" w:cs="Times New Roman"/>
-          <w:b/>
-          <w:bCs/>
-          <w:sz w:val="24"/>
-          <w:szCs w:val="24"/>
-        </w:rPr>
-        <w:t>)</w:t>
-      </w:r>
-    </w:p>
-    <w:p>
-      <w:pPr>
-        <w:spacing w:line="360" w:lineRule="auto"/>
-        <w:jc w:val="both"/>
-        <w:rPr>
-          <w:rFonts w:ascii="Times New Roman" w:hAnsi="Times New Roman" w:cs="Times New Roman"/>
-          <w:b/>
-          <w:bCs/>
-          <w:sz w:val="24"/>
-          <w:szCs w:val="24"/>
-        </w:rPr>
-      </w:pPr>
-      <w:r>
-        <w:rPr>
-          <w:rFonts w:ascii="Times New Roman" w:hAnsi="Times New Roman" w:cs="Times New Roman"/>
-          <w:b/>
-          <w:bCs/>
-          <w:sz w:val="24"/>
-          <w:szCs w:val="24"/>
-        </w:rPr>
-        <w:t>Introdução</w:t>
-      </w:r>
-    </w:p>
-    <w:p>
-      <w:pPr>
-        <w:spacing w:line="360" w:lineRule="auto"/>
-        <w:jc w:val="both"/>
-        <w:rPr>
-          <w:rFonts w:ascii="Times New Roman" w:hAnsi="Times New Roman" w:cs="Times New Roman"/>
-          <w:b/>
-          <w:bCs/>
-          <w:sz w:val="24"/>
-          <w:szCs w:val="24"/>
-        </w:rPr>
-      </w:pPr>
-      <w:r>
-        <w:rPr>
-          <w:rFonts w:ascii="Times New Roman" w:hAnsi="Times New Roman" w:cs="Times New Roman"/>
-          <w:b/>
-          <w:bCs/>
-          <w:sz w:val="24"/>
-          <w:szCs w:val="24"/>
-        </w:rPr>
         <w:t>Objectivo do Documento</w:t>
       </w:r>
     </w:p>
@@ -3821,25 +3285,7 @@
           <w:sz w:val="24"/>
           <w:szCs w:val="24"/>
         </w:rPr>
-        <w:t xml:space="preserve">elaborada segundo as boas práticas descritas por Ian </w:t>
-      </w:r>
-      <w:proofErr w:type="spellStart"/>
-      <w:r>
-        <w:rPr>
-          <w:rFonts w:ascii="Times New Roman" w:hAnsi="Times New Roman" w:cs="Times New Roman"/>
-          <w:sz w:val="24"/>
-          <w:szCs w:val="24"/>
-        </w:rPr>
-        <w:t>Sommerville</w:t>
-      </w:r>
-      <w:proofErr w:type="spellEnd"/>
-      <w:r>
-        <w:rPr>
-          <w:rFonts w:ascii="Times New Roman" w:hAnsi="Times New Roman" w:cs="Times New Roman"/>
-          <w:sz w:val="24"/>
-          <w:szCs w:val="24"/>
-        </w:rPr>
-        <w:t>, servindo</w:t>
+        <w:t>elaborada segundo as boas práticas descritas por Ian Sommerville, servindo</w:t>
       </w:r>
       <w:r>
         <w:rPr>
@@ -3995,36 +3441,8 @@
           <w:sz w:val="24"/>
           <w:szCs w:val="24"/>
         </w:rPr>
-        <w:t xml:space="preserve">: Software </w:t>
-      </w:r>
-      <w:proofErr w:type="spellStart"/>
-      <w:r>
-        <w:rPr>
-          <w:rFonts w:ascii="Times New Roman" w:hAnsi="Times New Roman" w:cs="Times New Roman"/>
-          <w:sz w:val="24"/>
-          <w:szCs w:val="24"/>
-        </w:rPr>
-        <w:t>Requirements</w:t>
-      </w:r>
-      <w:proofErr w:type="spellEnd"/>
-      <w:r>
-        <w:rPr>
-          <w:rFonts w:ascii="Times New Roman" w:hAnsi="Times New Roman" w:cs="Times New Roman"/>
-          <w:sz w:val="24"/>
-          <w:szCs w:val="24"/>
-        </w:rPr>
-        <w:t xml:space="preserve"> </w:t>
-      </w:r>
-      <w:proofErr w:type="spellStart"/>
-      <w:r>
-        <w:rPr>
-          <w:rFonts w:ascii="Times New Roman" w:hAnsi="Times New Roman" w:cs="Times New Roman"/>
-          <w:sz w:val="24"/>
-          <w:szCs w:val="24"/>
-        </w:rPr>
-        <w:t>Specification</w:t>
-      </w:r>
-      <w:proofErr w:type="spellEnd"/>
+        <w:t>: Software Requirements Specification</w:t>
+      </w:r>
     </w:p>
     <w:p>
       <w:pPr>
@@ -4129,23 +3547,13 @@
           <w:szCs w:val="24"/>
         </w:rPr>
       </w:pPr>
-      <w:proofErr w:type="spellStart"/>
-      <w:r>
-        <w:rPr>
-          <w:rFonts w:ascii="Times New Roman" w:hAnsi="Times New Roman" w:cs="Times New Roman"/>
-          <w:sz w:val="24"/>
-          <w:szCs w:val="24"/>
-        </w:rPr>
-        <w:t>Sommerville</w:t>
-      </w:r>
-      <w:proofErr w:type="spellEnd"/>
-      <w:r>
-        <w:rPr>
-          <w:rFonts w:ascii="Times New Roman" w:hAnsi="Times New Roman" w:cs="Times New Roman"/>
-          <w:sz w:val="24"/>
-          <w:szCs w:val="24"/>
-        </w:rPr>
-        <w:t xml:space="preserve">, Ian. </w:t>
+      <w:r>
+        <w:rPr>
+          <w:rFonts w:ascii="Times New Roman" w:hAnsi="Times New Roman" w:cs="Times New Roman"/>
+          <w:sz w:val="24"/>
+          <w:szCs w:val="24"/>
+        </w:rPr>
+        <w:t xml:space="preserve">Sommerville, Ian. </w:t>
       </w:r>
       <w:r>
         <w:rPr>
@@ -4279,160 +3687,25 @@
           <w:sz w:val="24"/>
           <w:szCs w:val="24"/>
         </w:rPr>
-        <w:t>É</w:t>
-      </w:r>
-      <w:r>
-        <w:rPr>
-          <w:rFonts w:ascii="Times New Roman" w:hAnsi="Times New Roman" w:cs="Times New Roman"/>
-          <w:sz w:val="24"/>
-          <w:szCs w:val="24"/>
-        </w:rPr>
-        <w:t xml:space="preserve"> um software que permite às empresas registar vendas, emitir facturas e acompanhar, de forma contínua, a entrada, saída e quantidade disponível de produtos em armazém.</w:t>
-      </w:r>
-      <w:r>
-        <w:rPr>
-          <w:rFonts w:ascii="Times New Roman" w:hAnsi="Times New Roman" w:cs="Times New Roman"/>
-          <w:sz w:val="24"/>
-          <w:szCs w:val="24"/>
-        </w:rPr>
-        <w:t xml:space="preserve"> </w:t>
-      </w:r>
-      <w:r>
-        <w:rPr>
-          <w:rFonts w:ascii="Times New Roman" w:hAnsi="Times New Roman" w:cs="Times New Roman"/>
-          <w:sz w:val="24"/>
-          <w:szCs w:val="24"/>
-        </w:rPr>
-        <w:t>O</w:t>
-      </w:r>
-      <w:r>
-        <w:rPr>
-          <w:rFonts w:ascii="Times New Roman" w:hAnsi="Times New Roman" w:cs="Times New Roman"/>
-          <w:sz w:val="24"/>
-          <w:szCs w:val="24"/>
-        </w:rPr>
-        <w:t xml:space="preserve"> sistema assegura que cada venda seja correctamente registada e que não se vendam produtos inexistentes, fornecendo uma visão clara do stock actual e do valor das transacções realizadas.</w:t>
-      </w:r>
-    </w:p>
-    <w:p>
-      <w:pPr>
-        <w:spacing w:line="360" w:lineRule="auto"/>
-        <w:jc w:val="both"/>
-        <w:rPr>
-          <w:rFonts w:ascii="Times New Roman" w:hAnsi="Times New Roman" w:cs="Times New Roman"/>
-          <w:sz w:val="24"/>
-          <w:szCs w:val="24"/>
-        </w:rPr>
-      </w:pPr>
-      <w:r>
-        <w:rPr>
-          <w:rFonts w:ascii="Times New Roman" w:hAnsi="Times New Roman" w:cs="Times New Roman"/>
-          <w:sz w:val="24"/>
-          <w:szCs w:val="24"/>
-        </w:rPr>
-        <w:t>O sistema integrar o processo de facturação com o controlo de stock, garantindo que cada factura emitida provoca automaticamente a correspondente saída de produtos do armazém. Da mesma forma, as compras e recepções de mercadorias são registadas como entradas de stock, permitindo que o saldo seja calculado de forma automática e consistente. Esta integração reduz erros manuais, aumenta a fiabilidade da informação e possibilita o controlo em tempo real das operações.</w:t>
-      </w:r>
-    </w:p>
-    <w:p>
-      <w:pPr>
-        <w:spacing w:line="360" w:lineRule="auto"/>
-        <w:jc w:val="both"/>
-        <w:rPr>
-          <w:rFonts w:ascii="Times New Roman" w:hAnsi="Times New Roman" w:cs="Times New Roman"/>
-          <w:sz w:val="24"/>
-          <w:szCs w:val="24"/>
-        </w:rPr>
-      </w:pPr>
-      <w:r>
-        <w:rPr>
-          <w:rFonts w:ascii="Times New Roman" w:hAnsi="Times New Roman" w:cs="Times New Roman"/>
-          <w:sz w:val="24"/>
-          <w:szCs w:val="24"/>
-        </w:rPr>
-        <w:t>O</w:t>
-      </w:r>
-      <w:r>
-        <w:rPr>
-          <w:rFonts w:ascii="Times New Roman" w:hAnsi="Times New Roman" w:cs="Times New Roman"/>
-          <w:sz w:val="24"/>
-          <w:szCs w:val="24"/>
-        </w:rPr>
-        <w:t xml:space="preserve"> sistema incorporara funcionalidades de gestão financeira, como o registo de pagamentos, controlo de facturas pagas, parcialmente pagas ou em dívida, bem como a gestão de caixa e conta corrente. </w:t>
-      </w:r>
-      <w:r>
-        <w:rPr>
-          <w:rFonts w:ascii="Times New Roman" w:hAnsi="Times New Roman" w:cs="Times New Roman"/>
-          <w:sz w:val="24"/>
-          <w:szCs w:val="24"/>
-        </w:rPr>
-        <w:t>O</w:t>
-      </w:r>
-      <w:r>
-        <w:rPr>
-          <w:rFonts w:ascii="Times New Roman" w:hAnsi="Times New Roman" w:cs="Times New Roman"/>
-          <w:sz w:val="24"/>
-          <w:szCs w:val="24"/>
-        </w:rPr>
-        <w:t xml:space="preserve"> sistema é capaz de gerar relatórios detalhados de vendas, produtos mais comercializados, níveis de stock, desempenho financeiro e comportamento de clientes, apoiando directamente a tomada de decisões de gestão.</w:t>
-      </w:r>
-    </w:p>
-    <w:p>
-      <w:pPr>
-        <w:spacing w:line="360" w:lineRule="auto"/>
-        <w:jc w:val="both"/>
-        <w:rPr>
-          <w:rFonts w:ascii="Times New Roman" w:hAnsi="Times New Roman" w:cs="Times New Roman"/>
-          <w:sz w:val="24"/>
-          <w:szCs w:val="24"/>
-        </w:rPr>
-      </w:pPr>
-      <w:r>
-        <w:rPr>
-          <w:rFonts w:ascii="Times New Roman" w:hAnsi="Times New Roman" w:cs="Times New Roman"/>
-          <w:sz w:val="24"/>
-          <w:szCs w:val="24"/>
-        </w:rPr>
-        <w:t>O</w:t>
-      </w:r>
-      <w:r>
-        <w:rPr>
-          <w:rFonts w:ascii="Times New Roman" w:hAnsi="Times New Roman" w:cs="Times New Roman"/>
-          <w:sz w:val="24"/>
-          <w:szCs w:val="24"/>
-        </w:rPr>
-        <w:t xml:space="preserve"> sistema </w:t>
-      </w:r>
-      <w:r>
-        <w:rPr>
-          <w:rFonts w:ascii="Times New Roman" w:hAnsi="Times New Roman" w:cs="Times New Roman"/>
-          <w:sz w:val="24"/>
-          <w:szCs w:val="24"/>
-        </w:rPr>
-        <w:t>inclui</w:t>
-      </w:r>
-      <w:r>
-        <w:rPr>
-          <w:rFonts w:ascii="Times New Roman" w:hAnsi="Times New Roman" w:cs="Times New Roman"/>
-          <w:sz w:val="24"/>
-          <w:szCs w:val="24"/>
-        </w:rPr>
-        <w:t xml:space="preserve"> mecanismos de segurança e controlo de acessos, definindo perfis de utilizador com permissões específicas, além de funcionalidades técnicas, integridade referencial, controlo de transacções</w:t>
-      </w:r>
-      <w:r>
-        <w:rPr>
-          <w:rFonts w:ascii="Times New Roman" w:hAnsi="Times New Roman" w:cs="Times New Roman"/>
-          <w:sz w:val="24"/>
-          <w:szCs w:val="24"/>
-        </w:rPr>
-        <w:t xml:space="preserve"> e</w:t>
-      </w:r>
-      <w:r>
-        <w:rPr>
-          <w:rFonts w:ascii="Times New Roman" w:hAnsi="Times New Roman" w:cs="Times New Roman"/>
-          <w:sz w:val="24"/>
-          <w:szCs w:val="24"/>
-        </w:rPr>
-        <w:t xml:space="preserve"> auditoria. Em síntese, trata-se de um sistema integrado que transforma operações comerciais em informação fiável, organizada e estratégica para a gestão do negócio.</w:t>
+        <w:t xml:space="preserve">A perspectiva geral do produto segue a descrição funcional e conceptual apresentada anteriormente na secção </w:t>
+      </w:r>
+      <w:r>
+        <w:rPr>
+          <w:rFonts w:ascii="Times New Roman" w:hAnsi="Times New Roman" w:cs="Times New Roman"/>
+          <w:i/>
+          <w:iCs/>
+          <w:sz w:val="24"/>
+          <w:szCs w:val="24"/>
+        </w:rPr>
+        <w:t>“Descrição do Sistema Proposto”</w:t>
+      </w:r>
+      <w:r>
+        <w:rPr>
+          <w:rFonts w:ascii="Times New Roman" w:hAnsi="Times New Roman" w:cs="Times New Roman"/>
+          <w:sz w:val="24"/>
+          <w:szCs w:val="24"/>
+        </w:rPr>
+        <w:t>. O sistema consiste numa solução integrada de facturação e controlo de stock que assegura o registo correcto das transacções comerciais, a actualização automática dos saldos de stock e o suporte à gestão financeira e operacional das empresas moçambicanas.</w:t>
       </w:r>
     </w:p>
     <w:p>
@@ -4460,203 +3733,57 @@
     </w:p>
     <w:p>
       <w:pPr>
-        <w:numPr>
-          <w:ilvl w:val="0"/>
-          <w:numId w:val="26"/>
-        </w:numPr>
-        <w:spacing w:line="360" w:lineRule="auto"/>
-        <w:jc w:val="both"/>
-        <w:rPr>
-          <w:rFonts w:ascii="Times New Roman" w:hAnsi="Times New Roman" w:cs="Times New Roman"/>
-          <w:sz w:val="24"/>
-          <w:szCs w:val="24"/>
-        </w:rPr>
-      </w:pPr>
-      <w:r>
-        <w:rPr>
-          <w:rFonts w:ascii="Times New Roman" w:hAnsi="Times New Roman" w:cs="Times New Roman"/>
-          <w:sz w:val="24"/>
-          <w:szCs w:val="24"/>
-        </w:rPr>
-        <w:t>Registo e emissão de facturas e recibos.</w:t>
-      </w:r>
-    </w:p>
-    <w:p>
-      <w:pPr>
-        <w:numPr>
-          <w:ilvl w:val="0"/>
-          <w:numId w:val="26"/>
-        </w:numPr>
-        <w:spacing w:line="360" w:lineRule="auto"/>
-        <w:jc w:val="both"/>
-        <w:rPr>
-          <w:rFonts w:ascii="Times New Roman" w:hAnsi="Times New Roman" w:cs="Times New Roman"/>
-          <w:sz w:val="24"/>
-          <w:szCs w:val="24"/>
-        </w:rPr>
-      </w:pPr>
-      <w:r>
-        <w:rPr>
-          <w:rFonts w:ascii="Times New Roman" w:hAnsi="Times New Roman" w:cs="Times New Roman"/>
-          <w:sz w:val="24"/>
-          <w:szCs w:val="24"/>
-        </w:rPr>
-        <w:t>Gestão de entradas e saídas de stock, atualização automática de quantidades.</w:t>
-      </w:r>
-    </w:p>
-    <w:p>
-      <w:pPr>
-        <w:numPr>
-          <w:ilvl w:val="0"/>
-          <w:numId w:val="26"/>
-        </w:numPr>
-        <w:spacing w:line="360" w:lineRule="auto"/>
-        <w:jc w:val="both"/>
-        <w:rPr>
-          <w:rFonts w:ascii="Times New Roman" w:hAnsi="Times New Roman" w:cs="Times New Roman"/>
-          <w:sz w:val="24"/>
-          <w:szCs w:val="24"/>
-        </w:rPr>
-      </w:pPr>
-      <w:r>
-        <w:rPr>
-          <w:rFonts w:ascii="Times New Roman" w:hAnsi="Times New Roman" w:cs="Times New Roman"/>
-          <w:sz w:val="24"/>
-          <w:szCs w:val="24"/>
-        </w:rPr>
-        <w:t>Controle de pagamentos, dívidas e contas correntes.</w:t>
-      </w:r>
-    </w:p>
-    <w:p>
-      <w:pPr>
-        <w:numPr>
-          <w:ilvl w:val="0"/>
-          <w:numId w:val="26"/>
-        </w:numPr>
-        <w:spacing w:line="360" w:lineRule="auto"/>
-        <w:jc w:val="both"/>
-        <w:rPr>
-          <w:rFonts w:ascii="Times New Roman" w:hAnsi="Times New Roman" w:cs="Times New Roman"/>
-          <w:sz w:val="24"/>
-          <w:szCs w:val="24"/>
-        </w:rPr>
-      </w:pPr>
-      <w:r>
-        <w:rPr>
-          <w:rFonts w:ascii="Times New Roman" w:hAnsi="Times New Roman" w:cs="Times New Roman"/>
-          <w:sz w:val="24"/>
-          <w:szCs w:val="24"/>
-        </w:rPr>
-        <w:t>Suporte para múltiplos armazéns e empresas.</w:t>
-      </w:r>
-    </w:p>
-    <w:p>
-      <w:pPr>
-        <w:numPr>
-          <w:ilvl w:val="0"/>
-          <w:numId w:val="26"/>
-        </w:numPr>
-        <w:spacing w:line="360" w:lineRule="auto"/>
-        <w:jc w:val="both"/>
-        <w:rPr>
-          <w:rFonts w:ascii="Times New Roman" w:hAnsi="Times New Roman" w:cs="Times New Roman"/>
-          <w:sz w:val="24"/>
-          <w:szCs w:val="24"/>
-        </w:rPr>
-      </w:pPr>
-      <w:r>
-        <w:rPr>
-          <w:rFonts w:ascii="Times New Roman" w:hAnsi="Times New Roman" w:cs="Times New Roman"/>
-          <w:sz w:val="24"/>
-          <w:szCs w:val="24"/>
-        </w:rPr>
-        <w:t>Configuração de impostos e integração com sistemas contábeis.</w:t>
-      </w:r>
-    </w:p>
-    <w:p>
-      <w:pPr>
-        <w:numPr>
-          <w:ilvl w:val="0"/>
-          <w:numId w:val="26"/>
-        </w:numPr>
-        <w:spacing w:line="360" w:lineRule="auto"/>
-        <w:jc w:val="both"/>
-        <w:rPr>
-          <w:rFonts w:ascii="Times New Roman" w:hAnsi="Times New Roman" w:cs="Times New Roman"/>
-          <w:sz w:val="24"/>
-          <w:szCs w:val="24"/>
-        </w:rPr>
-      </w:pPr>
-      <w:r>
-        <w:rPr>
-          <w:rFonts w:ascii="Times New Roman" w:hAnsi="Times New Roman" w:cs="Times New Roman"/>
-          <w:sz w:val="24"/>
-          <w:szCs w:val="24"/>
-        </w:rPr>
-        <w:lastRenderedPageBreak/>
-        <w:t>Relatórios detalhados de vendas, produtos, stock e desempenho financeiro.</w:t>
-      </w:r>
-    </w:p>
-    <w:p>
-      <w:pPr>
-        <w:numPr>
-          <w:ilvl w:val="0"/>
-          <w:numId w:val="26"/>
-        </w:numPr>
-        <w:spacing w:line="360" w:lineRule="auto"/>
-        <w:jc w:val="both"/>
-        <w:rPr>
-          <w:rFonts w:ascii="Times New Roman" w:hAnsi="Times New Roman" w:cs="Times New Roman"/>
-          <w:sz w:val="24"/>
-          <w:szCs w:val="24"/>
-        </w:rPr>
-      </w:pPr>
-      <w:r>
-        <w:rPr>
-          <w:rFonts w:ascii="Times New Roman" w:hAnsi="Times New Roman" w:cs="Times New Roman"/>
-          <w:sz w:val="24"/>
-          <w:szCs w:val="24"/>
-        </w:rPr>
-        <w:t>Perfis de utilizador, níveis de acesso e auditoria de operações.</w:t>
-      </w:r>
-    </w:p>
-    <w:p>
-      <w:pPr>
-        <w:numPr>
-          <w:ilvl w:val="0"/>
-          <w:numId w:val="26"/>
-        </w:numPr>
-        <w:spacing w:line="360" w:lineRule="auto"/>
-        <w:jc w:val="both"/>
-        <w:rPr>
-          <w:rFonts w:ascii="Times New Roman" w:hAnsi="Times New Roman" w:cs="Times New Roman"/>
-          <w:sz w:val="24"/>
-          <w:szCs w:val="24"/>
-        </w:rPr>
-      </w:pPr>
-      <w:r>
-        <w:rPr>
-          <w:rFonts w:ascii="Times New Roman" w:hAnsi="Times New Roman" w:cs="Times New Roman"/>
-          <w:sz w:val="24"/>
-          <w:szCs w:val="24"/>
-        </w:rPr>
-        <w:t xml:space="preserve">Operação </w:t>
-      </w:r>
-      <w:r>
-        <w:rPr>
-          <w:rFonts w:ascii="Times New Roman" w:hAnsi="Times New Roman" w:cs="Times New Roman"/>
-          <w:sz w:val="24"/>
-          <w:szCs w:val="24"/>
-        </w:rPr>
-        <w:t>STAND ALONE</w:t>
-      </w:r>
-      <w:r>
-        <w:rPr>
-          <w:rFonts w:ascii="Times New Roman" w:hAnsi="Times New Roman" w:cs="Times New Roman"/>
-          <w:sz w:val="24"/>
-          <w:szCs w:val="24"/>
-        </w:rPr>
-        <w:t>, independente da internet.</w:t>
+        <w:spacing w:line="360" w:lineRule="auto"/>
+        <w:jc w:val="both"/>
+        <w:rPr>
+          <w:rFonts w:ascii="Times New Roman" w:hAnsi="Times New Roman" w:cs="Times New Roman"/>
+          <w:sz w:val="24"/>
+          <w:szCs w:val="24"/>
+        </w:rPr>
+      </w:pPr>
+      <w:r>
+        <w:rPr>
+          <w:rFonts w:ascii="Times New Roman" w:hAnsi="Times New Roman" w:cs="Times New Roman"/>
+          <w:sz w:val="24"/>
+          <w:szCs w:val="24"/>
+        </w:rPr>
+        <w:t xml:space="preserve">As funções do produto correspondem às funcionalidades já descritas nas secções </w:t>
+      </w:r>
+      <w:r>
+        <w:rPr>
+          <w:rFonts w:ascii="Times New Roman" w:hAnsi="Times New Roman" w:cs="Times New Roman"/>
+          <w:i/>
+          <w:iCs/>
+          <w:sz w:val="24"/>
+          <w:szCs w:val="24"/>
+        </w:rPr>
+        <w:t>“Descrição do Sistema Proposto”</w:t>
+      </w:r>
+      <w:r>
+        <w:rPr>
+          <w:rFonts w:ascii="Times New Roman" w:hAnsi="Times New Roman" w:cs="Times New Roman"/>
+          <w:sz w:val="24"/>
+          <w:szCs w:val="24"/>
+        </w:rPr>
+        <w:t xml:space="preserve"> e </w:t>
+      </w:r>
+      <w:r>
+        <w:rPr>
+          <w:rFonts w:ascii="Times New Roman" w:hAnsi="Times New Roman" w:cs="Times New Roman"/>
+          <w:i/>
+          <w:iCs/>
+          <w:sz w:val="24"/>
+          <w:szCs w:val="24"/>
+        </w:rPr>
+        <w:t>“Análise de Viabilidade”</w:t>
+      </w:r>
+      <w:r>
+        <w:rPr>
+          <w:rFonts w:ascii="Times New Roman" w:hAnsi="Times New Roman" w:cs="Times New Roman"/>
+          <w:sz w:val="24"/>
+          <w:szCs w:val="24"/>
+        </w:rPr>
+        <w:t>, sendo aqui resumidas para fins de referência funcional no contexto da SRS.</w:t>
       </w:r>
     </w:p>
     <w:p>
@@ -5009,6 +4136,7 @@
           <w:sz w:val="24"/>
           <w:szCs w:val="24"/>
         </w:rPr>
+        <w:lastRenderedPageBreak/>
         <w:t>RF05 – Gerar relatórios de stock, vendas, clientes e desempenho financeiro.</w:t>
       </w:r>
     </w:p>
@@ -5270,16 +4398,7 @@
           <w:sz w:val="24"/>
           <w:szCs w:val="24"/>
         </w:rPr>
-        <w:t xml:space="preserve">RNF04 – Suporte à geração de </w:t>
-      </w:r>
-      <w:proofErr w:type="spellStart"/>
-      <w:r>
-        <w:rPr>
-          <w:rFonts w:ascii="Times New Roman" w:hAnsi="Times New Roman" w:cs="Times New Roman"/>
-          <w:sz w:val="24"/>
-          <w:szCs w:val="24"/>
-        </w:rPr>
-        <w:t>PDF</w:t>
+        <w:t>RNF04 – Suporte à geração de PDF</w:t>
       </w:r>
       <w:r>
         <w:rPr>
@@ -5295,16 +4414,7 @@
           <w:sz w:val="24"/>
           <w:szCs w:val="24"/>
         </w:rPr>
-        <w:t>s</w:t>
-      </w:r>
-      <w:proofErr w:type="spellEnd"/>
-      <w:r>
-        <w:rPr>
-          <w:rFonts w:ascii="Times New Roman" w:hAnsi="Times New Roman" w:cs="Times New Roman"/>
-          <w:sz w:val="24"/>
-          <w:szCs w:val="24"/>
-        </w:rPr>
-        <w:t xml:space="preserve"> profissionais com </w:t>
+        <w:t xml:space="preserve">s profissionais com </w:t>
       </w:r>
       <w:r>
         <w:rPr>
@@ -5343,16 +4453,7 @@
           <w:sz w:val="24"/>
           <w:szCs w:val="24"/>
         </w:rPr>
-        <w:t xml:space="preserve">RNF05 – Alta confiabilidade, desempenho e escalabilidade para </w:t>
-      </w:r>
-      <w:proofErr w:type="spellStart"/>
-      <w:r>
-        <w:rPr>
-          <w:rFonts w:ascii="Times New Roman" w:hAnsi="Times New Roman" w:cs="Times New Roman"/>
-          <w:sz w:val="24"/>
-          <w:szCs w:val="24"/>
-        </w:rPr>
-        <w:t>PME</w:t>
+        <w:t>RNF05 – Alta confiabilidade, desempenho e escalabilidade para PME</w:t>
       </w:r>
       <w:r>
         <w:rPr>
@@ -5368,16 +4469,7 @@
           <w:sz w:val="24"/>
           <w:szCs w:val="24"/>
         </w:rPr>
-        <w:t>s</w:t>
-      </w:r>
-      <w:proofErr w:type="spellEnd"/>
-      <w:r>
-        <w:rPr>
-          <w:rFonts w:ascii="Times New Roman" w:hAnsi="Times New Roman" w:cs="Times New Roman"/>
-          <w:sz w:val="24"/>
-          <w:szCs w:val="24"/>
-        </w:rPr>
-        <w:t>.</w:t>
+        <w:t>s.</w:t>
       </w:r>
     </w:p>
     <w:p>
@@ -5538,25 +4630,7 @@
           <w:szCs w:val="24"/>
         </w:rPr>
         <w:br/>
-        <w:t xml:space="preserve">Fluxo principal: Introduzir números → </w:t>
-      </w:r>
-      <w:proofErr w:type="spellStart"/>
-      <w:r>
-        <w:rPr>
-          <w:rFonts w:ascii="Times New Roman" w:hAnsi="Times New Roman" w:cs="Times New Roman"/>
-          <w:sz w:val="24"/>
-          <w:szCs w:val="24"/>
-        </w:rPr>
-        <w:t>Seleccionar</w:t>
-      </w:r>
-      <w:proofErr w:type="spellEnd"/>
-      <w:r>
-        <w:rPr>
-          <w:rFonts w:ascii="Times New Roman" w:hAnsi="Times New Roman" w:cs="Times New Roman"/>
-          <w:sz w:val="24"/>
-          <w:szCs w:val="24"/>
-        </w:rPr>
-        <w:t xml:space="preserve"> operação → Visualizar resultado.</w:t>
+        <w:t>Fluxo principal: Introduzir números → Seleccionar operação → Visualizar resultado.</w:t>
       </w:r>
     </w:p>
     <w:p>
@@ -5943,18 +5017,8 @@
           <w:sz w:val="24"/>
           <w:szCs w:val="24"/>
         </w:rPr>
-        <w:t xml:space="preserve">Resultados matemáticos </w:t>
-      </w:r>
-      <w:proofErr w:type="spellStart"/>
-      <w:r>
-        <w:rPr>
-          <w:rFonts w:ascii="Times New Roman" w:hAnsi="Times New Roman" w:cs="Times New Roman"/>
-          <w:sz w:val="24"/>
-          <w:szCs w:val="24"/>
-        </w:rPr>
-        <w:t>correctos</w:t>
-      </w:r>
-      <w:proofErr w:type="spellEnd"/>
+        <w:t>Resultados matemáticos correctos</w:t>
+      </w:r>
     </w:p>
     <w:p>
       <w:pPr>
@@ -6039,25 +5103,7 @@
           <w:sz w:val="24"/>
           <w:szCs w:val="24"/>
         </w:rPr>
-        <w:t xml:space="preserve">Este documento SRS representa a base oficial para o desenvolvimento e manutenção da aplicação Calculadora Simples, estando em conformidade com os princípios da Engenharia de Requisitos segundo Ian </w:t>
-      </w:r>
-      <w:proofErr w:type="spellStart"/>
-      <w:r>
-        <w:rPr>
-          <w:rFonts w:ascii="Times New Roman" w:hAnsi="Times New Roman" w:cs="Times New Roman"/>
-          <w:sz w:val="24"/>
-          <w:szCs w:val="24"/>
-        </w:rPr>
-        <w:t>Sommerville</w:t>
-      </w:r>
-      <w:proofErr w:type="spellEnd"/>
-      <w:r>
-        <w:rPr>
-          <w:rFonts w:ascii="Times New Roman" w:hAnsi="Times New Roman" w:cs="Times New Roman"/>
-          <w:sz w:val="24"/>
-          <w:szCs w:val="24"/>
-        </w:rPr>
-        <w:t>.</w:t>
+        <w:t>Este documento SRS representa a base oficial para o desenvolvimento e manutenção da aplicação Calculadora Simples, estando em conformidade com os princípios da Engenharia de Requisitos segundo Ian Sommerville.</w:t>
       </w:r>
     </w:p>
     <w:p>
@@ -9061,6 +8107,119 @@
     </w:lvl>
   </w:abstractNum>
   <w:abstractNum w:abstractNumId="20" w15:restartNumberingAfterBreak="0">
+    <w:nsid w:val="4D6D219B"/>
+    <w:multiLevelType w:val="hybridMultilevel"/>
+    <w:tmpl w:val="DA268588"/>
+    <w:lvl w:ilvl="0" w:tplc="0409000D">
+      <w:start w:val="1"/>
+      <w:numFmt w:val="bullet"/>
+      <w:lvlText w:val=""/>
+      <w:lvlJc w:val="left"/>
+      <w:pPr>
+        <w:ind w:left="720" w:hanging="360"/>
+      </w:pPr>
+      <w:rPr>
+        <w:rFonts w:ascii="Wingdings" w:hAnsi="Wingdings" w:hint="default"/>
+      </w:rPr>
+    </w:lvl>
+    <w:lvl w:ilvl="1" w:tplc="04090003" w:tentative="1">
+      <w:start w:val="1"/>
+      <w:numFmt w:val="bullet"/>
+      <w:lvlText w:val="o"/>
+      <w:lvlJc w:val="left"/>
+      <w:pPr>
+        <w:ind w:left="1440" w:hanging="360"/>
+      </w:pPr>
+      <w:rPr>
+        <w:rFonts w:ascii="Courier New" w:hAnsi="Courier New" w:cs="Courier New" w:hint="default"/>
+      </w:rPr>
+    </w:lvl>
+    <w:lvl w:ilvl="2" w:tplc="04090005" w:tentative="1">
+      <w:start w:val="1"/>
+      <w:numFmt w:val="bullet"/>
+      <w:lvlText w:val=""/>
+      <w:lvlJc w:val="left"/>
+      <w:pPr>
+        <w:ind w:left="2160" w:hanging="360"/>
+      </w:pPr>
+      <w:rPr>
+        <w:rFonts w:ascii="Wingdings" w:hAnsi="Wingdings" w:hint="default"/>
+      </w:rPr>
+    </w:lvl>
+    <w:lvl w:ilvl="3" w:tplc="04090001" w:tentative="1">
+      <w:start w:val="1"/>
+      <w:numFmt w:val="bullet"/>
+      <w:lvlText w:val=""/>
+      <w:lvlJc w:val="left"/>
+      <w:pPr>
+        <w:ind w:left="2880" w:hanging="360"/>
+      </w:pPr>
+      <w:rPr>
+        <w:rFonts w:ascii="Symbol" w:hAnsi="Symbol" w:hint="default"/>
+      </w:rPr>
+    </w:lvl>
+    <w:lvl w:ilvl="4" w:tplc="04090003" w:tentative="1">
+      <w:start w:val="1"/>
+      <w:numFmt w:val="bullet"/>
+      <w:lvlText w:val="o"/>
+      <w:lvlJc w:val="left"/>
+      <w:pPr>
+        <w:ind w:left="3600" w:hanging="360"/>
+      </w:pPr>
+      <w:rPr>
+        <w:rFonts w:ascii="Courier New" w:hAnsi="Courier New" w:cs="Courier New" w:hint="default"/>
+      </w:rPr>
+    </w:lvl>
+    <w:lvl w:ilvl="5" w:tplc="04090005" w:tentative="1">
+      <w:start w:val="1"/>
+      <w:numFmt w:val="bullet"/>
+      <w:lvlText w:val=""/>
+      <w:lvlJc w:val="left"/>
+      <w:pPr>
+        <w:ind w:left="4320" w:hanging="360"/>
+      </w:pPr>
+      <w:rPr>
+        <w:rFonts w:ascii="Wingdings" w:hAnsi="Wingdings" w:hint="default"/>
+      </w:rPr>
+    </w:lvl>
+    <w:lvl w:ilvl="6" w:tplc="04090001" w:tentative="1">
+      <w:start w:val="1"/>
+      <w:numFmt w:val="bullet"/>
+      <w:lvlText w:val=""/>
+      <w:lvlJc w:val="left"/>
+      <w:pPr>
+        <w:ind w:left="5040" w:hanging="360"/>
+      </w:pPr>
+      <w:rPr>
+        <w:rFonts w:ascii="Symbol" w:hAnsi="Symbol" w:hint="default"/>
+      </w:rPr>
+    </w:lvl>
+    <w:lvl w:ilvl="7" w:tplc="04090003" w:tentative="1">
+      <w:start w:val="1"/>
+      <w:numFmt w:val="bullet"/>
+      <w:lvlText w:val="o"/>
+      <w:lvlJc w:val="left"/>
+      <w:pPr>
+        <w:ind w:left="5760" w:hanging="360"/>
+      </w:pPr>
+      <w:rPr>
+        <w:rFonts w:ascii="Courier New" w:hAnsi="Courier New" w:cs="Courier New" w:hint="default"/>
+      </w:rPr>
+    </w:lvl>
+    <w:lvl w:ilvl="8" w:tplc="04090005" w:tentative="1">
+      <w:start w:val="1"/>
+      <w:numFmt w:val="bullet"/>
+      <w:lvlText w:val=""/>
+      <w:lvlJc w:val="left"/>
+      <w:pPr>
+        <w:ind w:left="6480" w:hanging="360"/>
+      </w:pPr>
+      <w:rPr>
+        <w:rFonts w:ascii="Wingdings" w:hAnsi="Wingdings" w:hint="default"/>
+      </w:rPr>
+    </w:lvl>
+  </w:abstractNum>
+  <w:abstractNum w:abstractNumId="21" w15:restartNumberingAfterBreak="0">
     <w:nsid w:val="52B07D03"/>
     <w:multiLevelType w:val="multilevel"/>
     <w:tmpl w:val="46A21CDA"/>
@@ -9173,7 +8332,7 @@
       </w:pPr>
     </w:lvl>
   </w:abstractNum>
-  <w:abstractNum w:abstractNumId="21" w15:restartNumberingAfterBreak="0">
+  <w:abstractNum w:abstractNumId="22" w15:restartNumberingAfterBreak="0">
     <w:nsid w:val="5A8B403F"/>
     <w:multiLevelType w:val="multilevel"/>
     <w:tmpl w:val="E0FE35E4"/>
@@ -9322,7 +8481,7 @@
       </w:rPr>
     </w:lvl>
   </w:abstractNum>
-  <w:abstractNum w:abstractNumId="22" w15:restartNumberingAfterBreak="0">
+  <w:abstractNum w:abstractNumId="23" w15:restartNumberingAfterBreak="0">
     <w:nsid w:val="5E4F363E"/>
     <w:multiLevelType w:val="multilevel"/>
     <w:tmpl w:val="0409001F"/>
@@ -9408,7 +8567,7 @@
       </w:pPr>
     </w:lvl>
   </w:abstractNum>
-  <w:abstractNum w:abstractNumId="23" w15:restartNumberingAfterBreak="0">
+  <w:abstractNum w:abstractNumId="24" w15:restartNumberingAfterBreak="0">
     <w:nsid w:val="628B2F89"/>
     <w:multiLevelType w:val="multilevel"/>
     <w:tmpl w:val="997468E8"/>
@@ -9521,7 +8680,93 @@
       </w:pPr>
     </w:lvl>
   </w:abstractNum>
-  <w:abstractNum w:abstractNumId="24" w15:restartNumberingAfterBreak="0">
+  <w:abstractNum w:abstractNumId="25" w15:restartNumberingAfterBreak="0">
+    <w:nsid w:val="661627FE"/>
+    <w:multiLevelType w:val="hybridMultilevel"/>
+    <w:tmpl w:val="E26858B0"/>
+    <w:lvl w:ilvl="0" w:tplc="0409000F">
+      <w:start w:val="1"/>
+      <w:numFmt w:val="decimal"/>
+      <w:lvlText w:val="%1."/>
+      <w:lvlJc w:val="left"/>
+      <w:pPr>
+        <w:ind w:left="720" w:hanging="360"/>
+      </w:pPr>
+    </w:lvl>
+    <w:lvl w:ilvl="1" w:tplc="04090019" w:tentative="1">
+      <w:start w:val="1"/>
+      <w:numFmt w:val="lowerLetter"/>
+      <w:lvlText w:val="%2."/>
+      <w:lvlJc w:val="left"/>
+      <w:pPr>
+        <w:ind w:left="1440" w:hanging="360"/>
+      </w:pPr>
+    </w:lvl>
+    <w:lvl w:ilvl="2" w:tplc="0409001B" w:tentative="1">
+      <w:start w:val="1"/>
+      <w:numFmt w:val="lowerRoman"/>
+      <w:lvlText w:val="%3."/>
+      <w:lvlJc w:val="right"/>
+      <w:pPr>
+        <w:ind w:left="2160" w:hanging="180"/>
+      </w:pPr>
+    </w:lvl>
+    <w:lvl w:ilvl="3" w:tplc="0409000F" w:tentative="1">
+      <w:start w:val="1"/>
+      <w:numFmt w:val="decimal"/>
+      <w:lvlText w:val="%4."/>
+      <w:lvlJc w:val="left"/>
+      <w:pPr>
+        <w:ind w:left="2880" w:hanging="360"/>
+      </w:pPr>
+    </w:lvl>
+    <w:lvl w:ilvl="4" w:tplc="04090019" w:tentative="1">
+      <w:start w:val="1"/>
+      <w:numFmt w:val="lowerLetter"/>
+      <w:lvlText w:val="%5."/>
+      <w:lvlJc w:val="left"/>
+      <w:pPr>
+        <w:ind w:left="3600" w:hanging="360"/>
+      </w:pPr>
+    </w:lvl>
+    <w:lvl w:ilvl="5" w:tplc="0409001B" w:tentative="1">
+      <w:start w:val="1"/>
+      <w:numFmt w:val="lowerRoman"/>
+      <w:lvlText w:val="%6."/>
+      <w:lvlJc w:val="right"/>
+      <w:pPr>
+        <w:ind w:left="4320" w:hanging="180"/>
+      </w:pPr>
+    </w:lvl>
+    <w:lvl w:ilvl="6" w:tplc="0409000F" w:tentative="1">
+      <w:start w:val="1"/>
+      <w:numFmt w:val="decimal"/>
+      <w:lvlText w:val="%7."/>
+      <w:lvlJc w:val="left"/>
+      <w:pPr>
+        <w:ind w:left="5040" w:hanging="360"/>
+      </w:pPr>
+    </w:lvl>
+    <w:lvl w:ilvl="7" w:tplc="04090019" w:tentative="1">
+      <w:start w:val="1"/>
+      <w:numFmt w:val="lowerLetter"/>
+      <w:lvlText w:val="%8."/>
+      <w:lvlJc w:val="left"/>
+      <w:pPr>
+        <w:ind w:left="5760" w:hanging="360"/>
+      </w:pPr>
+    </w:lvl>
+    <w:lvl w:ilvl="8" w:tplc="0409001B" w:tentative="1">
+      <w:start w:val="1"/>
+      <w:numFmt w:val="lowerRoman"/>
+      <w:lvlText w:val="%9."/>
+      <w:lvlJc w:val="right"/>
+      <w:pPr>
+        <w:ind w:left="6480" w:hanging="180"/>
+      </w:pPr>
+    </w:lvl>
+  </w:abstractNum>
+  <w:abstractNum w:abstractNumId="26" w15:restartNumberingAfterBreak="0">
     <w:nsid w:val="66313D54"/>
     <w:multiLevelType w:val="multilevel"/>
     <w:tmpl w:val="F588FC96"/>
@@ -9670,7 +8915,7 @@
       </w:rPr>
     </w:lvl>
   </w:abstractNum>
-  <w:abstractNum w:abstractNumId="25" w15:restartNumberingAfterBreak="0">
+  <w:abstractNum w:abstractNumId="27" w15:restartNumberingAfterBreak="0">
     <w:nsid w:val="665E63B8"/>
     <w:multiLevelType w:val="multilevel"/>
     <w:tmpl w:val="85D0DD6A"/>
@@ -9819,7 +9064,7 @@
       </w:rPr>
     </w:lvl>
   </w:abstractNum>
-  <w:abstractNum w:abstractNumId="26" w15:restartNumberingAfterBreak="0">
+  <w:abstractNum w:abstractNumId="28" w15:restartNumberingAfterBreak="0">
     <w:nsid w:val="69204DE8"/>
     <w:multiLevelType w:val="multilevel"/>
     <w:tmpl w:val="2870CD32"/>
@@ -9968,7 +9213,7 @@
       </w:rPr>
     </w:lvl>
   </w:abstractNum>
-  <w:abstractNum w:abstractNumId="27" w15:restartNumberingAfterBreak="0">
+  <w:abstractNum w:abstractNumId="29" w15:restartNumberingAfterBreak="0">
     <w:nsid w:val="69C21676"/>
     <w:multiLevelType w:val="multilevel"/>
     <w:tmpl w:val="0409001F"/>
@@ -10054,7 +9299,7 @@
       </w:pPr>
     </w:lvl>
   </w:abstractNum>
-  <w:abstractNum w:abstractNumId="28" w15:restartNumberingAfterBreak="0">
+  <w:abstractNum w:abstractNumId="30" w15:restartNumberingAfterBreak="0">
     <w:nsid w:val="6DB053B9"/>
     <w:multiLevelType w:val="multilevel"/>
     <w:tmpl w:val="742AEE00"/>
@@ -10203,7 +9448,7 @@
       </w:rPr>
     </w:lvl>
   </w:abstractNum>
-  <w:abstractNum w:abstractNumId="29" w15:restartNumberingAfterBreak="0">
+  <w:abstractNum w:abstractNumId="31" w15:restartNumberingAfterBreak="0">
     <w:nsid w:val="71DF4CF6"/>
     <w:multiLevelType w:val="multilevel"/>
     <w:tmpl w:val="A112AEF6"/>
@@ -10352,7 +9597,7 @@
       </w:rPr>
     </w:lvl>
   </w:abstractNum>
-  <w:abstractNum w:abstractNumId="30" w15:restartNumberingAfterBreak="0">
+  <w:abstractNum w:abstractNumId="32" w15:restartNumberingAfterBreak="0">
     <w:nsid w:val="76893CE3"/>
     <w:multiLevelType w:val="multilevel"/>
     <w:tmpl w:val="3326980A"/>
@@ -10501,7 +9746,7 @@
       </w:rPr>
     </w:lvl>
   </w:abstractNum>
-  <w:abstractNum w:abstractNumId="31" w15:restartNumberingAfterBreak="0">
+  <w:abstractNum w:abstractNumId="33" w15:restartNumberingAfterBreak="0">
     <w:nsid w:val="7BB81AAE"/>
     <w:multiLevelType w:val="multilevel"/>
     <w:tmpl w:val="9042CA16"/>
@@ -10650,7 +9895,7 @@
       </w:rPr>
     </w:lvl>
   </w:abstractNum>
-  <w:abstractNum w:abstractNumId="32" w15:restartNumberingAfterBreak="0">
+  <w:abstractNum w:abstractNumId="34" w15:restartNumberingAfterBreak="0">
     <w:nsid w:val="7CAD4967"/>
     <w:multiLevelType w:val="multilevel"/>
     <w:tmpl w:val="866E95E8"/>
@@ -10812,22 +10057,22 @@
     <w:abstractNumId w:val="13"/>
   </w:num>
   <w:num w:numId="5" w16cid:durableId="809324099">
-    <w:abstractNumId w:val="20"/>
+    <w:abstractNumId w:val="21"/>
   </w:num>
   <w:num w:numId="6" w16cid:durableId="626011384">
     <w:abstractNumId w:val="8"/>
   </w:num>
   <w:num w:numId="7" w16cid:durableId="1353456030">
-    <w:abstractNumId w:val="29"/>
+    <w:abstractNumId w:val="31"/>
   </w:num>
   <w:num w:numId="8" w16cid:durableId="642587674">
-    <w:abstractNumId w:val="32"/>
+    <w:abstractNumId w:val="34"/>
   </w:num>
   <w:num w:numId="9" w16cid:durableId="1856000271">
     <w:abstractNumId w:val="15"/>
   </w:num>
   <w:num w:numId="10" w16cid:durableId="475340359">
-    <w:abstractNumId w:val="30"/>
+    <w:abstractNumId w:val="32"/>
   </w:num>
   <w:num w:numId="11" w16cid:durableId="699401513">
     <w:abstractNumId w:val="16"/>
@@ -10848,10 +10093,10 @@
     <w:abstractNumId w:val="1"/>
   </w:num>
   <w:num w:numId="17" w16cid:durableId="1454249210">
-    <w:abstractNumId w:val="26"/>
+    <w:abstractNumId w:val="28"/>
   </w:num>
   <w:num w:numId="18" w16cid:durableId="373969041">
-    <w:abstractNumId w:val="31"/>
+    <w:abstractNumId w:val="33"/>
   </w:num>
   <w:num w:numId="19" w16cid:durableId="1484468306">
     <w:abstractNumId w:val="4"/>
@@ -10860,7 +10105,7 @@
     <w:abstractNumId w:val="0"/>
   </w:num>
   <w:num w:numId="21" w16cid:durableId="1834954385">
-    <w:abstractNumId w:val="25"/>
+    <w:abstractNumId w:val="27"/>
   </w:num>
   <w:num w:numId="22" w16cid:durableId="1357393096">
     <w:abstractNumId w:val="10"/>
@@ -10869,19 +10114,19 @@
     <w:abstractNumId w:val="3"/>
   </w:num>
   <w:num w:numId="24" w16cid:durableId="1949853248">
-    <w:abstractNumId w:val="21"/>
+    <w:abstractNumId w:val="22"/>
   </w:num>
   <w:num w:numId="25" w16cid:durableId="1542479416">
-    <w:abstractNumId w:val="24"/>
+    <w:abstractNumId w:val="26"/>
   </w:num>
   <w:num w:numId="26" w16cid:durableId="949316654">
     <w:abstractNumId w:val="18"/>
   </w:num>
   <w:num w:numId="27" w16cid:durableId="229075827">
-    <w:abstractNumId w:val="23"/>
+    <w:abstractNumId w:val="24"/>
   </w:num>
   <w:num w:numId="28" w16cid:durableId="452020886">
-    <w:abstractNumId w:val="28"/>
+    <w:abstractNumId w:val="30"/>
   </w:num>
   <w:num w:numId="29" w16cid:durableId="618413704">
     <w:abstractNumId w:val="9"/>
@@ -10890,13 +10135,19 @@
     <w:abstractNumId w:val="12"/>
   </w:num>
   <w:num w:numId="31" w16cid:durableId="119497029">
-    <w:abstractNumId w:val="22"/>
+    <w:abstractNumId w:val="23"/>
   </w:num>
   <w:num w:numId="32" w16cid:durableId="1045518164">
-    <w:abstractNumId w:val="27"/>
+    <w:abstractNumId w:val="29"/>
   </w:num>
   <w:num w:numId="33" w16cid:durableId="83185306">
     <w:abstractNumId w:val="6"/>
+  </w:num>
+  <w:num w:numId="34" w16cid:durableId="1232159619">
+    <w:abstractNumId w:val="20"/>
+  </w:num>
+  <w:num w:numId="35" w16cid:durableId="1757436792">
+    <w:abstractNumId w:val="25"/>
   </w:num>
 </w:numbering>
 </file>
@@ -11504,7 +10755,6 @@
   <w:style w:type="character" w:default="1" w:styleId="DefaultParagraphFont">
     <w:name w:val="Default Paragraph Font"/>
     <w:uiPriority w:val="1"/>
-    <w:semiHidden/>
     <w:unhideWhenUsed/>
   </w:style>
   <w:style w:type="table" w:default="1" w:styleId="TableNormal">

</xml_diff>

<commit_message>
refactor(class: Cliente e dependentes): correcao de atributos das classes MODEL, DAO, SERVICE e CONTROLLERR de modo que possam reflectir a nova estrutura das tabelas do banco de dados
</commit_message>
<xml_diff>
--- a/Projeto modelo dezembro de 2025 - Copy.docx
+++ b/Projeto modelo dezembro de 2025 - Copy.docx
@@ -80,7 +80,23 @@
           <w:sz w:val="24"/>
           <w:szCs w:val="24"/>
         </w:rPr>
-        <w:t>s) a expandirem operações de comércio, retalho e distribuição. A digitalização de processos financeiros e de gestão de stock ainda é parcial, com muitas empresas a depender de soluções manuais, planilhas ou sistemas desatualizados.</w:t>
+        <w:t xml:space="preserve">s) a expandirem operações de comércio, retalho e </w:t>
+      </w:r>
+      <w:r>
+        <w:rPr>
+          <w:rFonts w:ascii="Times New Roman" w:hAnsi="Times New Roman" w:cs="Times New Roman"/>
+          <w:sz w:val="24"/>
+          <w:szCs w:val="24"/>
+        </w:rPr>
+        <w:t>por grosso</w:t>
+      </w:r>
+      <w:r>
+        <w:rPr>
+          <w:rFonts w:ascii="Times New Roman" w:hAnsi="Times New Roman" w:cs="Times New Roman"/>
+          <w:sz w:val="24"/>
+          <w:szCs w:val="24"/>
+        </w:rPr>
+        <w:t>. A digitalização de processos financeiros e de gestão de stock ainda é parcial, com muitas empresas a depender de soluções manuais, planilhas ou sistemas desatualizados.</w:t>
       </w:r>
     </w:p>
     <w:p>
@@ -245,7 +261,23 @@
           <w:sz w:val="24"/>
           <w:szCs w:val="24"/>
         </w:rPr>
-        <w:t>Redução de erros humanos e otimização do tempo dos colaboradores.</w:t>
+        <w:t>Redução de erros humanos e o</w:t>
+      </w:r>
+      <w:r>
+        <w:rPr>
+          <w:rFonts w:ascii="Times New Roman" w:hAnsi="Times New Roman" w:cs="Times New Roman"/>
+          <w:sz w:val="24"/>
+          <w:szCs w:val="24"/>
+        </w:rPr>
+        <w:t>p</w:t>
+      </w:r>
+      <w:r>
+        <w:rPr>
+          <w:rFonts w:ascii="Times New Roman" w:hAnsi="Times New Roman" w:cs="Times New Roman"/>
+          <w:sz w:val="24"/>
+          <w:szCs w:val="24"/>
+        </w:rPr>
+        <w:t>timização do tempo dos colaboradores.</w:t>
       </w:r>
     </w:p>
     <w:p>
@@ -271,19 +303,6 @@
         </w:rPr>
         <w:t>Segurança da informação e controlo de acessos.</w:t>
       </w:r>
-    </w:p>
-    <w:p>
-      <w:pPr>
-        <w:spacing w:line="360" w:lineRule="auto"/>
-        <w:jc w:val="both"/>
-        <w:rPr>
-          <w:rFonts w:ascii="Times New Roman" w:hAnsi="Times New Roman" w:cs="Times New Roman"/>
-          <w:b/>
-          <w:bCs/>
-          <w:sz w:val="24"/>
-          <w:szCs w:val="24"/>
-        </w:rPr>
-      </w:pPr>
     </w:p>
     <w:p>
       <w:pPr>
@@ -774,8 +793,6 @@
     </w:p>
     <w:p>
       <w:pPr>
-        <w:spacing w:line="360" w:lineRule="auto"/>
-        <w:jc w:val="both"/>
         <w:rPr>
           <w:rFonts w:ascii="Times New Roman" w:hAnsi="Times New Roman" w:cs="Times New Roman"/>
           <w:b/>
@@ -784,6 +801,16 @@
           <w:szCs w:val="24"/>
         </w:rPr>
       </w:pPr>
+      <w:r>
+        <w:rPr>
+          <w:rFonts w:ascii="Times New Roman" w:hAnsi="Times New Roman" w:cs="Times New Roman"/>
+          <w:b/>
+          <w:bCs/>
+          <w:sz w:val="24"/>
+          <w:szCs w:val="24"/>
+        </w:rPr>
+        <w:br w:type="page"/>
+      </w:r>
     </w:p>
     <w:p>
       <w:pPr>
@@ -934,7 +961,23 @@
           <w:sz w:val="24"/>
           <w:szCs w:val="24"/>
         </w:rPr>
-        <w:t>Crescente interesse por soluções digitais seguras e conformes com a legislação fiscal moçambicana.</w:t>
+        <w:t>Crescente interesse por soluções digitais seguras e conforme</w:t>
+      </w:r>
+      <w:r>
+        <w:rPr>
+          <w:rFonts w:ascii="Times New Roman" w:hAnsi="Times New Roman" w:cs="Times New Roman"/>
+          <w:sz w:val="24"/>
+          <w:szCs w:val="24"/>
+        </w:rPr>
+        <w:t>s</w:t>
+      </w:r>
+      <w:r>
+        <w:rPr>
+          <w:rFonts w:ascii="Times New Roman" w:hAnsi="Times New Roman" w:cs="Times New Roman"/>
+          <w:sz w:val="24"/>
+          <w:szCs w:val="24"/>
+        </w:rPr>
+        <w:t xml:space="preserve"> com a legislação fiscal moçambicana.</w:t>
       </w:r>
     </w:p>
     <w:p>

</xml_diff>

<commit_message>
FIX(VendasPorFacturacaoViewController): Correcao de pagamento de facturas parceladas
</commit_message>
<xml_diff>
--- a/Projeto modelo dezembro de 2025 - Copy.docx
+++ b/Projeto modelo dezembro de 2025 - Copy.docx
@@ -64,7 +64,16 @@
           <w:sz w:val="24"/>
           <w:szCs w:val="24"/>
         </w:rPr>
-        <w:t>O mercado moçambicano apresenta um crescimento constante no setor empresarial, com um número crescente de pequenas e médias empresas (PME</w:t>
+        <w:t>O mercado moçambicano apresenta um crescimento constante no setor empresarial, com um número crescente de pequenas e médias empresas (</w:t>
+      </w:r>
+      <w:proofErr w:type="spellStart"/>
+      <w:r>
+        <w:rPr>
+          <w:rFonts w:ascii="Times New Roman" w:hAnsi="Times New Roman" w:cs="Times New Roman"/>
+          <w:sz w:val="24"/>
+          <w:szCs w:val="24"/>
+        </w:rPr>
+        <w:t>PME</w:t>
       </w:r>
       <w:r>
         <w:rPr>
@@ -80,7 +89,16 @@
           <w:sz w:val="24"/>
           <w:szCs w:val="24"/>
         </w:rPr>
-        <w:t xml:space="preserve">s) a expandirem operações de comércio, retalho e </w:t>
+        <w:t>s</w:t>
+      </w:r>
+      <w:proofErr w:type="spellEnd"/>
+      <w:r>
+        <w:rPr>
+          <w:rFonts w:ascii="Times New Roman" w:hAnsi="Times New Roman" w:cs="Times New Roman"/>
+          <w:sz w:val="24"/>
+          <w:szCs w:val="24"/>
+        </w:rPr>
+        <w:t xml:space="preserve">) a expandirem operações de comércio, retalho e </w:t>
       </w:r>
       <w:r>
         <w:rPr>
@@ -654,7 +672,16 @@
                 <w:sz w:val="24"/>
                 <w:szCs w:val="24"/>
               </w:rPr>
-              <w:t>Alto custo, pouco flexível para PME</w:t>
+              <w:t xml:space="preserve">Alto custo, pouco flexível para </w:t>
+            </w:r>
+            <w:proofErr w:type="spellStart"/>
+            <w:r>
+              <w:rPr>
+                <w:rFonts w:ascii="Times New Roman" w:hAnsi="Times New Roman" w:cs="Times New Roman"/>
+                <w:sz w:val="24"/>
+                <w:szCs w:val="24"/>
+              </w:rPr>
+              <w:t>PME</w:t>
             </w:r>
             <w:r>
               <w:rPr>
@@ -672,6 +699,7 @@
               </w:rPr>
               <w:t>s</w:t>
             </w:r>
+            <w:proofErr w:type="spellEnd"/>
           </w:p>
         </w:tc>
       </w:tr>
@@ -697,7 +725,25 @@
                 <w:sz w:val="24"/>
                 <w:szCs w:val="24"/>
               </w:rPr>
-              <w:t>Sage One /Sage 50</w:t>
+              <w:t xml:space="preserve">Sage </w:t>
+            </w:r>
+            <w:proofErr w:type="spellStart"/>
+            <w:r>
+              <w:rPr>
+                <w:rFonts w:ascii="Times New Roman" w:hAnsi="Times New Roman" w:cs="Times New Roman"/>
+                <w:sz w:val="24"/>
+                <w:szCs w:val="24"/>
+              </w:rPr>
+              <w:t>One</w:t>
+            </w:r>
+            <w:proofErr w:type="spellEnd"/>
+            <w:r>
+              <w:rPr>
+                <w:rFonts w:ascii="Times New Roman" w:hAnsi="Times New Roman" w:cs="Times New Roman"/>
+                <w:sz w:val="24"/>
+                <w:szCs w:val="24"/>
+              </w:rPr>
+              <w:t xml:space="preserve"> /Sage 50</w:t>
             </w:r>
           </w:p>
         </w:tc>
@@ -897,7 +943,16 @@
           <w:sz w:val="24"/>
           <w:szCs w:val="24"/>
         </w:rPr>
-        <w:t>Falta de soluções acessíveis e intuitivas para PME</w:t>
+        <w:t xml:space="preserve">Falta de soluções acessíveis e intuitivas para </w:t>
+      </w:r>
+      <w:proofErr w:type="spellStart"/>
+      <w:r>
+        <w:rPr>
+          <w:rFonts w:ascii="Times New Roman" w:hAnsi="Times New Roman" w:cs="Times New Roman"/>
+          <w:sz w:val="24"/>
+          <w:szCs w:val="24"/>
+        </w:rPr>
+        <w:t>PME</w:t>
       </w:r>
       <w:r>
         <w:rPr>
@@ -913,7 +968,16 @@
           <w:sz w:val="24"/>
           <w:szCs w:val="24"/>
         </w:rPr>
-        <w:t>s, combinando facturação e controlo de stock.</w:t>
+        <w:t>s</w:t>
+      </w:r>
+      <w:proofErr w:type="spellEnd"/>
+      <w:r>
+        <w:rPr>
+          <w:rFonts w:ascii="Times New Roman" w:hAnsi="Times New Roman" w:cs="Times New Roman"/>
+          <w:sz w:val="24"/>
+          <w:szCs w:val="24"/>
+        </w:rPr>
+        <w:t>, combinando facturação e controlo de stock.</w:t>
       </w:r>
     </w:p>
     <w:p>
@@ -2194,7 +2258,25 @@
           <w:sz w:val="24"/>
           <w:szCs w:val="24"/>
         </w:rPr>
-        <w:t>Do ponto de vista operacional, o sistema foi concebido para reflectir os fluxos de trabalho existentes nas empresas moçambicanas, como o registo de vendas, emissão de facturas, gestão de entradas e saídas de stock, controlo de pagamentos e acompanhamento de dívidas. A integração entre facturação e stock permite que as operações sejam realizadas de forma automática e consistente, reduzindo tarefas manuais repetitivas e minimizando erros humanos, o que aumenta a eficiência operacional.</w:t>
+        <w:t xml:space="preserve">Do ponto de vista operacional, o sistema foi concebido para </w:t>
+      </w:r>
+      <w:proofErr w:type="spellStart"/>
+      <w:r>
+        <w:rPr>
+          <w:rFonts w:ascii="Times New Roman" w:hAnsi="Times New Roman" w:cs="Times New Roman"/>
+          <w:sz w:val="24"/>
+          <w:szCs w:val="24"/>
+        </w:rPr>
+        <w:t>reflectir</w:t>
+      </w:r>
+      <w:proofErr w:type="spellEnd"/>
+      <w:r>
+        <w:rPr>
+          <w:rFonts w:ascii="Times New Roman" w:hAnsi="Times New Roman" w:cs="Times New Roman"/>
+          <w:sz w:val="24"/>
+          <w:szCs w:val="24"/>
+        </w:rPr>
+        <w:t xml:space="preserve"> os fluxos de trabalho existentes nas empresas moçambicanas, como o registo de vendas, emissão de facturas, gestão de entradas e saídas de stock, controlo de pagamentos e acompanhamento de dívidas. A integração entre facturação e stock permite que as operações sejam realizadas de forma automática e consistente, reduzindo tarefas manuais repetitivas e minimizando erros humanos, o que aumenta a eficiência operacional.</w:t>
       </w:r>
     </w:p>
     <w:p>
@@ -2950,6 +3032,7 @@
         </w:rPr>
         <w:br w:type="page"/>
       </w:r>
+      <w:proofErr w:type="spellStart"/>
       <w:r>
         <w:rPr>
           <w:rFonts w:ascii="Times New Roman" w:hAnsi="Times New Roman" w:cs="Times New Roman"/>
@@ -2959,7 +3042,18 @@
           <w:szCs w:val="24"/>
         </w:rPr>
         <w:lastRenderedPageBreak/>
-        <w:t>Elicitação e Análise de Requisitos</w:t>
+        <w:t>Elicitação</w:t>
+      </w:r>
+      <w:proofErr w:type="spellEnd"/>
+      <w:r>
+        <w:rPr>
+          <w:rFonts w:ascii="Times New Roman" w:hAnsi="Times New Roman" w:cs="Times New Roman"/>
+          <w:b/>
+          <w:bCs/>
+          <w:sz w:val="24"/>
+          <w:szCs w:val="24"/>
+        </w:rPr>
+        <w:t xml:space="preserve"> e Análise de Requisitos</w:t>
       </w:r>
     </w:p>
     <w:p>
@@ -3207,13 +3301,10 @@
           <w:szCs w:val="24"/>
         </w:rPr>
         <w:lastRenderedPageBreak/>
-        <w:t>Documentação de Requisitos (SRS – Software Requirements Specification)</w:t>
-      </w:r>
-    </w:p>
-    <w:p>
-      <w:pPr>
-        <w:spacing w:line="360" w:lineRule="auto"/>
-        <w:jc w:val="both"/>
+        <w:t xml:space="preserve">Documentação de Requisitos (SRS – Software </w:t>
+      </w:r>
+      <w:proofErr w:type="spellStart"/>
+      <w:r>
         <w:rPr>
           <w:rFonts w:ascii="Times New Roman" w:hAnsi="Times New Roman" w:cs="Times New Roman"/>
           <w:b/>
@@ -3221,7 +3312,9 @@
           <w:sz w:val="24"/>
           <w:szCs w:val="24"/>
         </w:rPr>
-      </w:pPr>
+        <w:t>Requirements</w:t>
+      </w:r>
+      <w:proofErr w:type="spellEnd"/>
       <w:r>
         <w:rPr>
           <w:rFonts w:ascii="Times New Roman" w:hAnsi="Times New Roman" w:cs="Times New Roman"/>
@@ -3230,13 +3323,10 @@
           <w:sz w:val="24"/>
           <w:szCs w:val="24"/>
         </w:rPr>
-        <w:t>Introdução</w:t>
-      </w:r>
-    </w:p>
-    <w:p>
-      <w:pPr>
-        <w:spacing w:line="360" w:lineRule="auto"/>
-        <w:jc w:val="both"/>
+        <w:t xml:space="preserve"> </w:t>
+      </w:r>
+      <w:proofErr w:type="spellStart"/>
+      <w:r>
         <w:rPr>
           <w:rFonts w:ascii="Times New Roman" w:hAnsi="Times New Roman" w:cs="Times New Roman"/>
           <w:b/>
@@ -3244,7 +3334,9 @@
           <w:sz w:val="24"/>
           <w:szCs w:val="24"/>
         </w:rPr>
-      </w:pPr>
+        <w:t>Specification</w:t>
+      </w:r>
+      <w:proofErr w:type="spellEnd"/>
       <w:r>
         <w:rPr>
           <w:rFonts w:ascii="Times New Roman" w:hAnsi="Times New Roman" w:cs="Times New Roman"/>
@@ -3253,6 +3345,52 @@
           <w:sz w:val="24"/>
           <w:szCs w:val="24"/>
         </w:rPr>
+        <w:t>)</w:t>
+      </w:r>
+    </w:p>
+    <w:p>
+      <w:pPr>
+        <w:spacing w:line="360" w:lineRule="auto"/>
+        <w:jc w:val="both"/>
+        <w:rPr>
+          <w:rFonts w:ascii="Times New Roman" w:hAnsi="Times New Roman" w:cs="Times New Roman"/>
+          <w:b/>
+          <w:bCs/>
+          <w:sz w:val="24"/>
+          <w:szCs w:val="24"/>
+        </w:rPr>
+      </w:pPr>
+      <w:r>
+        <w:rPr>
+          <w:rFonts w:ascii="Times New Roman" w:hAnsi="Times New Roman" w:cs="Times New Roman"/>
+          <w:b/>
+          <w:bCs/>
+          <w:sz w:val="24"/>
+          <w:szCs w:val="24"/>
+        </w:rPr>
+        <w:t>Introdução</w:t>
+      </w:r>
+    </w:p>
+    <w:p>
+      <w:pPr>
+        <w:spacing w:line="360" w:lineRule="auto"/>
+        <w:jc w:val="both"/>
+        <w:rPr>
+          <w:rFonts w:ascii="Times New Roman" w:hAnsi="Times New Roman" w:cs="Times New Roman"/>
+          <w:b/>
+          <w:bCs/>
+          <w:sz w:val="24"/>
+          <w:szCs w:val="24"/>
+        </w:rPr>
+      </w:pPr>
+      <w:r>
+        <w:rPr>
+          <w:rFonts w:ascii="Times New Roman" w:hAnsi="Times New Roman" w:cs="Times New Roman"/>
+          <w:b/>
+          <w:bCs/>
+          <w:sz w:val="24"/>
+          <w:szCs w:val="24"/>
+        </w:rPr>
         <w:t>Objectivo do Documento</w:t>
       </w:r>
     </w:p>
@@ -3280,23 +3418,7 @@
           <w:sz w:val="24"/>
           <w:szCs w:val="24"/>
         </w:rPr>
-        <w:t>a Especificação de Requisitos de Software (SRS)</w:t>
-      </w:r>
-      <w:r>
-        <w:rPr>
-          <w:rFonts w:ascii="Times New Roman" w:hAnsi="Times New Roman" w:cs="Times New Roman"/>
-          <w:sz w:val="24"/>
-          <w:szCs w:val="24"/>
-        </w:rPr>
-        <w:t xml:space="preserve"> para d</w:t>
-      </w:r>
-      <w:r>
-        <w:rPr>
-          <w:rFonts w:ascii="Times New Roman" w:hAnsi="Times New Roman" w:cs="Times New Roman"/>
-          <w:sz w:val="24"/>
-          <w:szCs w:val="24"/>
-        </w:rPr>
-        <w:t xml:space="preserve">esenvolver um sistema de facturação e controlo de stock </w:t>
+        <w:t xml:space="preserve">a Especificação de Requisitos de Software (SRS) para desenvolver um sistema de facturação e controlo de stock </w:t>
       </w:r>
       <w:r>
         <w:rPr>
@@ -3312,23 +3434,25 @@
           <w:sz w:val="24"/>
           <w:szCs w:val="24"/>
         </w:rPr>
-        <w:t>, destinado a empresas moçambicanas, que permita gerir vendas, facturação, stock, pagamentos, relatórios e dados financeiros de forma integrada, segura e eficiente</w:t>
-      </w:r>
-      <w:r>
-        <w:rPr>
-          <w:rFonts w:ascii="Times New Roman" w:hAnsi="Times New Roman" w:cs="Times New Roman"/>
-          <w:sz w:val="24"/>
-          <w:szCs w:val="24"/>
-        </w:rPr>
-        <w:t xml:space="preserve">; </w:t>
-      </w:r>
-      <w:r>
-        <w:rPr>
-          <w:rFonts w:ascii="Times New Roman" w:hAnsi="Times New Roman" w:cs="Times New Roman"/>
-          <w:sz w:val="24"/>
-          <w:szCs w:val="24"/>
-        </w:rPr>
-        <w:t>elaborada segundo as boas práticas descritas por Ian Sommerville, servindo</w:t>
+        <w:t xml:space="preserve">, destinado a empresas moçambicanas, que permita gerir vendas, facturação, stock, pagamentos, relatórios e dados financeiros de forma integrada, segura e eficiente; elaborada segundo as boas práticas descritas por Ian </w:t>
+      </w:r>
+      <w:proofErr w:type="spellStart"/>
+      <w:r>
+        <w:rPr>
+          <w:rFonts w:ascii="Times New Roman" w:hAnsi="Times New Roman" w:cs="Times New Roman"/>
+          <w:sz w:val="24"/>
+          <w:szCs w:val="24"/>
+        </w:rPr>
+        <w:t>Sommerville</w:t>
+      </w:r>
+      <w:proofErr w:type="spellEnd"/>
+      <w:r>
+        <w:rPr>
+          <w:rFonts w:ascii="Times New Roman" w:hAnsi="Times New Roman" w:cs="Times New Roman"/>
+          <w:sz w:val="24"/>
+          <w:szCs w:val="24"/>
+        </w:rPr>
+        <w:t>, servindo</w:t>
       </w:r>
       <w:r>
         <w:rPr>
@@ -3484,8 +3608,36 @@
           <w:sz w:val="24"/>
           <w:szCs w:val="24"/>
         </w:rPr>
-        <w:t>: Software Requirements Specification</w:t>
-      </w:r>
+        <w:t xml:space="preserve">: Software </w:t>
+      </w:r>
+      <w:proofErr w:type="spellStart"/>
+      <w:r>
+        <w:rPr>
+          <w:rFonts w:ascii="Times New Roman" w:hAnsi="Times New Roman" w:cs="Times New Roman"/>
+          <w:sz w:val="24"/>
+          <w:szCs w:val="24"/>
+        </w:rPr>
+        <w:t>Requirements</w:t>
+      </w:r>
+      <w:proofErr w:type="spellEnd"/>
+      <w:r>
+        <w:rPr>
+          <w:rFonts w:ascii="Times New Roman" w:hAnsi="Times New Roman" w:cs="Times New Roman"/>
+          <w:sz w:val="24"/>
+          <w:szCs w:val="24"/>
+        </w:rPr>
+        <w:t xml:space="preserve"> </w:t>
+      </w:r>
+      <w:proofErr w:type="spellStart"/>
+      <w:r>
+        <w:rPr>
+          <w:rFonts w:ascii="Times New Roman" w:hAnsi="Times New Roman" w:cs="Times New Roman"/>
+          <w:sz w:val="24"/>
+          <w:szCs w:val="24"/>
+        </w:rPr>
+        <w:t>Specification</w:t>
+      </w:r>
+      <w:proofErr w:type="spellEnd"/>
     </w:p>
     <w:p>
       <w:pPr>
@@ -3590,13 +3742,23 @@
           <w:szCs w:val="24"/>
         </w:rPr>
       </w:pPr>
-      <w:r>
-        <w:rPr>
-          <w:rFonts w:ascii="Times New Roman" w:hAnsi="Times New Roman" w:cs="Times New Roman"/>
-          <w:sz w:val="24"/>
-          <w:szCs w:val="24"/>
-        </w:rPr>
-        <w:t xml:space="preserve">Sommerville, Ian. </w:t>
+      <w:proofErr w:type="spellStart"/>
+      <w:r>
+        <w:rPr>
+          <w:rFonts w:ascii="Times New Roman" w:hAnsi="Times New Roman" w:cs="Times New Roman"/>
+          <w:sz w:val="24"/>
+          <w:szCs w:val="24"/>
+        </w:rPr>
+        <w:t>Sommerville</w:t>
+      </w:r>
+      <w:proofErr w:type="spellEnd"/>
+      <w:r>
+        <w:rPr>
+          <w:rFonts w:ascii="Times New Roman" w:hAnsi="Times New Roman" w:cs="Times New Roman"/>
+          <w:sz w:val="24"/>
+          <w:szCs w:val="24"/>
+        </w:rPr>
+        <w:t xml:space="preserve">, Ian. </w:t>
       </w:r>
       <w:r>
         <w:rPr>
@@ -4441,7 +4603,16 @@
           <w:sz w:val="24"/>
           <w:szCs w:val="24"/>
         </w:rPr>
-        <w:t>RNF04 – Suporte à geração de PDF</w:t>
+        <w:t xml:space="preserve">RNF04 – Suporte à geração de </w:t>
+      </w:r>
+      <w:proofErr w:type="spellStart"/>
+      <w:r>
+        <w:rPr>
+          <w:rFonts w:ascii="Times New Roman" w:hAnsi="Times New Roman" w:cs="Times New Roman"/>
+          <w:sz w:val="24"/>
+          <w:szCs w:val="24"/>
+        </w:rPr>
+        <w:t>PDF</w:t>
       </w:r>
       <w:r>
         <w:rPr>
@@ -4457,7 +4628,16 @@
           <w:sz w:val="24"/>
           <w:szCs w:val="24"/>
         </w:rPr>
-        <w:t xml:space="preserve">s profissionais com </w:t>
+        <w:t>s</w:t>
+      </w:r>
+      <w:proofErr w:type="spellEnd"/>
+      <w:r>
+        <w:rPr>
+          <w:rFonts w:ascii="Times New Roman" w:hAnsi="Times New Roman" w:cs="Times New Roman"/>
+          <w:sz w:val="24"/>
+          <w:szCs w:val="24"/>
+        </w:rPr>
+        <w:t xml:space="preserve"> profissionais com </w:t>
       </w:r>
       <w:r>
         <w:rPr>
@@ -4496,7 +4676,16 @@
           <w:sz w:val="24"/>
           <w:szCs w:val="24"/>
         </w:rPr>
-        <w:t>RNF05 – Alta confiabilidade, desempenho e escalabilidade para PME</w:t>
+        <w:t xml:space="preserve">RNF05 – Alta confiabilidade, desempenho e escalabilidade para </w:t>
+      </w:r>
+      <w:proofErr w:type="spellStart"/>
+      <w:r>
+        <w:rPr>
+          <w:rFonts w:ascii="Times New Roman" w:hAnsi="Times New Roman" w:cs="Times New Roman"/>
+          <w:sz w:val="24"/>
+          <w:szCs w:val="24"/>
+        </w:rPr>
+        <w:t>PME</w:t>
       </w:r>
       <w:r>
         <w:rPr>
@@ -4512,7 +4701,16 @@
           <w:sz w:val="24"/>
           <w:szCs w:val="24"/>
         </w:rPr>
-        <w:t>s.</w:t>
+        <w:t>s</w:t>
+      </w:r>
+      <w:proofErr w:type="spellEnd"/>
+      <w:r>
+        <w:rPr>
+          <w:rFonts w:ascii="Times New Roman" w:hAnsi="Times New Roman" w:cs="Times New Roman"/>
+          <w:sz w:val="24"/>
+          <w:szCs w:val="24"/>
+        </w:rPr>
+        <w:t>.</w:t>
       </w:r>
     </w:p>
     <w:p>
@@ -4643,37 +4841,77 @@
         <w:jc w:val="both"/>
         <w:rPr>
           <w:rFonts w:ascii="Times New Roman" w:hAnsi="Times New Roman" w:cs="Times New Roman"/>
-          <w:sz w:val="24"/>
-          <w:szCs w:val="24"/>
-        </w:rPr>
-      </w:pPr>
-      <w:r>
-        <w:rPr>
-          <w:rFonts w:ascii="Times New Roman" w:hAnsi="Times New Roman" w:cs="Times New Roman"/>
           <w:b/>
           <w:bCs/>
           <w:sz w:val="24"/>
           <w:szCs w:val="24"/>
         </w:rPr>
+      </w:pPr>
+      <w:r>
+        <w:rPr>
+          <w:rFonts w:ascii="Times New Roman" w:hAnsi="Times New Roman" w:cs="Times New Roman"/>
+          <w:b/>
+          <w:bCs/>
+          <w:sz w:val="24"/>
+          <w:szCs w:val="24"/>
+        </w:rPr>
         <w:t>UC01 – Realizar Cálculo</w:t>
       </w:r>
-      <w:r>
-        <w:rPr>
-          <w:rFonts w:ascii="Times New Roman" w:hAnsi="Times New Roman" w:cs="Times New Roman"/>
-          <w:sz w:val="24"/>
-          <w:szCs w:val="24"/>
-        </w:rPr>
-        <w:br/>
+    </w:p>
+    <w:p>
+      <w:pPr>
+        <w:spacing w:line="360" w:lineRule="auto"/>
+        <w:jc w:val="both"/>
+        <w:rPr>
+          <w:rFonts w:ascii="Times New Roman" w:hAnsi="Times New Roman" w:cs="Times New Roman"/>
+          <w:sz w:val="24"/>
+          <w:szCs w:val="24"/>
+        </w:rPr>
+      </w:pPr>
+      <w:r>
+        <w:rPr>
+          <w:rFonts w:ascii="Times New Roman" w:hAnsi="Times New Roman" w:cs="Times New Roman"/>
+          <w:sz w:val="24"/>
+          <w:szCs w:val="24"/>
+        </w:rPr>
         <w:t>Actor: Utilizador</w:t>
       </w:r>
-      <w:r>
-        <w:rPr>
-          <w:rFonts w:ascii="Times New Roman" w:hAnsi="Times New Roman" w:cs="Times New Roman"/>
-          <w:sz w:val="24"/>
-          <w:szCs w:val="24"/>
-        </w:rPr>
-        <w:br/>
-        <w:t>Fluxo principal: Introduzir números → Seleccionar operação → Visualizar resultado.</w:t>
+    </w:p>
+    <w:p>
+      <w:pPr>
+        <w:spacing w:line="360" w:lineRule="auto"/>
+        <w:jc w:val="both"/>
+        <w:rPr>
+          <w:rFonts w:ascii="Times New Roman" w:hAnsi="Times New Roman" w:cs="Times New Roman"/>
+          <w:sz w:val="24"/>
+          <w:szCs w:val="24"/>
+        </w:rPr>
+      </w:pPr>
+      <w:r>
+        <w:rPr>
+          <w:rFonts w:ascii="Times New Roman" w:hAnsi="Times New Roman" w:cs="Times New Roman"/>
+          <w:sz w:val="24"/>
+          <w:szCs w:val="24"/>
+        </w:rPr>
+        <w:t xml:space="preserve">Fluxo principal: Introduzir números → </w:t>
+      </w:r>
+      <w:proofErr w:type="spellStart"/>
+      <w:r>
+        <w:rPr>
+          <w:rFonts w:ascii="Times New Roman" w:hAnsi="Times New Roman" w:cs="Times New Roman"/>
+          <w:sz w:val="24"/>
+          <w:szCs w:val="24"/>
+        </w:rPr>
+        <w:t>Seleccionar</w:t>
+      </w:r>
+      <w:proofErr w:type="spellEnd"/>
+      <w:r>
+        <w:rPr>
+          <w:rFonts w:ascii="Times New Roman" w:hAnsi="Times New Roman" w:cs="Times New Roman"/>
+          <w:sz w:val="24"/>
+          <w:szCs w:val="24"/>
+        </w:rPr>
+        <w:t xml:space="preserve"> operação → Visualizar resultado.</w:t>
       </w:r>
     </w:p>
     <w:p>
@@ -4693,7 +4931,7 @@
           <w:szCs w:val="24"/>
         </w:rPr>
         <w:pict>
-          <v:rect id="_x0000_i1039" style="width:0;height:1.5pt" o:hralign="center" o:hrstd="t" o:hr="t" fillcolor="#a0a0a0" stroked="f"/>
+          <v:rect id="_x0000_i1025" style="width:0;height:1.5pt" o:hralign="center" o:hrstd="t" o:hr="t" fillcolor="#a0a0a0" stroked="f"/>
         </w:pict>
       </w:r>
     </w:p>
@@ -4806,7 +5044,7 @@
           <w:szCs w:val="24"/>
         </w:rPr>
         <w:pict>
-          <v:rect id="_x0000_i1040" style="width:0;height:1.5pt" o:hralign="center" o:hrstd="t" o:hr="t" fillcolor="#a0a0a0" stroked="f"/>
+          <v:rect id="_x0000_i1026" style="width:0;height:1.5pt" o:hralign="center" o:hrstd="t" o:hr="t" fillcolor="#a0a0a0" stroked="f"/>
         </w:pict>
       </w:r>
     </w:p>
@@ -4990,7 +5228,7 @@
           <w:szCs w:val="24"/>
         </w:rPr>
         <w:pict>
-          <v:rect id="_x0000_i1041" style="width:0;height:1.5pt" o:hralign="center" o:hrstd="t" o:hr="t" fillcolor="#a0a0a0" stroked="f"/>
+          <v:rect id="_x0000_i1027" style="width:0;height:1.5pt" o:hralign="center" o:hrstd="t" o:hr="t" fillcolor="#a0a0a0" stroked="f"/>
         </w:pict>
       </w:r>
     </w:p>
@@ -5060,8 +5298,18 @@
           <w:sz w:val="24"/>
           <w:szCs w:val="24"/>
         </w:rPr>
-        <w:t>Resultados matemáticos correctos</w:t>
-      </w:r>
+        <w:t xml:space="preserve">Resultados matemáticos </w:t>
+      </w:r>
+      <w:proofErr w:type="spellStart"/>
+      <w:r>
+        <w:rPr>
+          <w:rFonts w:ascii="Times New Roman" w:hAnsi="Times New Roman" w:cs="Times New Roman"/>
+          <w:sz w:val="24"/>
+          <w:szCs w:val="24"/>
+        </w:rPr>
+        <w:t>correctos</w:t>
+      </w:r>
+      <w:proofErr w:type="spellEnd"/>
     </w:p>
     <w:p>
       <w:pPr>
@@ -5103,7 +5351,7 @@
           <w:szCs w:val="24"/>
         </w:rPr>
         <w:pict>
-          <v:rect id="_x0000_i1042" style="width:0;height:1.5pt" o:hralign="center" o:hrstd="t" o:hr="t" fillcolor="#a0a0a0" stroked="f"/>
+          <v:rect id="_x0000_i1028" style="width:0;height:1.5pt" o:hralign="center" o:hrstd="t" o:hr="t" fillcolor="#a0a0a0" stroked="f"/>
         </w:pict>
       </w:r>
     </w:p>
@@ -5146,7 +5394,25 @@
           <w:sz w:val="24"/>
           <w:szCs w:val="24"/>
         </w:rPr>
-        <w:t>Este documento SRS representa a base oficial para o desenvolvimento e manutenção da aplicação Calculadora Simples, estando em conformidade com os princípios da Engenharia de Requisitos segundo Ian Sommerville.</w:t>
+        <w:t xml:space="preserve">Este documento SRS representa a base oficial para o desenvolvimento e manutenção da aplicação Calculadora Simples, estando em conformidade com os princípios da Engenharia de Requisitos segundo Ian </w:t>
+      </w:r>
+      <w:proofErr w:type="spellStart"/>
+      <w:r>
+        <w:rPr>
+          <w:rFonts w:ascii="Times New Roman" w:hAnsi="Times New Roman" w:cs="Times New Roman"/>
+          <w:sz w:val="24"/>
+          <w:szCs w:val="24"/>
+        </w:rPr>
+        <w:t>Sommerville</w:t>
+      </w:r>
+      <w:proofErr w:type="spellEnd"/>
+      <w:r>
+        <w:rPr>
+          <w:rFonts w:ascii="Times New Roman" w:hAnsi="Times New Roman" w:cs="Times New Roman"/>
+          <w:sz w:val="24"/>
+          <w:szCs w:val="24"/>
+        </w:rPr>
+        <w:t>.</w:t>
       </w:r>
     </w:p>
     <w:p>
@@ -5166,7 +5432,7 @@
           <w:szCs w:val="24"/>
         </w:rPr>
         <w:pict>
-          <v:rect id="_x0000_i1043" style="width:0;height:1.5pt" o:hralign="center" o:hrstd="t" o:hr="t" fillcolor="#a0a0a0" stroked="f"/>
+          <v:rect id="_x0000_i1029" style="width:0;height:1.5pt" o:hralign="center" o:hrstd="t" o:hr="t" fillcolor="#a0a0a0" stroked="f"/>
         </w:pict>
       </w:r>
     </w:p>
@@ -10798,6 +11064,7 @@
   <w:style w:type="character" w:default="1" w:styleId="DefaultParagraphFont">
     <w:name w:val="Default Paragraph Font"/>
     <w:uiPriority w:val="1"/>
+    <w:semiHidden/>
     <w:unhideWhenUsed/>
   </w:style>
   <w:style w:type="table" w:default="1" w:styleId="TableNormal">

</xml_diff>